<commit_message>
Fix clouds, make rainbow horizontal, add 3 activities, expand descriptions
- Rebuild cloud shape with a clean bounded path (no more clipping) on the
  rain page and the rainbow.
- Rainbow is now horizontal/panoramic with full clouds at both bases.
- Add 3 new sticker activities over objects/animals: Semáforo, Mariposa
  (simetría) and Mariquita (puntos negros). New SVGs + renders.
- Expand every activity description with a friendlier, richer text and the
  learning benefit.
- Book is now 19 pages; fonts re-embedded.

Co-authored-by: hectorrios-ui <hectorrios-ui@users.noreply.github.com>
</commit_message>
<xml_diff>
--- a/libro-stickers-digital/Libro_Actividades_Stickers_Mi_Dulce_Emma.docx
+++ b/libro-stickers-digital/Libro_Actividades_Stickers_Mi_Dulce_Emma.docx
@@ -1015,7 +1015,7 @@
           <w:color w:val="3A3A4A"/>
           <w:sz w:val="28"/>
         </w:rPr>
-        <w:t>Pon las llantas a cada carrito usando los stickers del mismo color del coche.</w:t>
+        <w:t>¡Estos carritos quieren rodar, pero perdieron sus llantas! Observa bien de qué color es cada coche y pégale sus ruedas usando los stickers del mismo color. Así practicamos la asociación de colores y la motricidad fina de los deditos.</w:t>
       </w:r>
     </w:p>
     <w:p>
@@ -1118,7 +1118,7 @@
           <w:color w:val="3A3A4A"/>
           <w:sz w:val="28"/>
         </w:rPr>
-        <w:t>Asociación de colores: pega los stickers según el color de cada corazón.</w:t>
+        <w:t>Cada corazón tiene su propio color. Pega los stickers dentro de cada uno usando el mismo color de su contorno: amarillo con amarillo, azul con azul y rojo con rojo. Es un juego ideal para reconocer y asociar los colores.</w:t>
       </w:r>
     </w:p>
     <w:p>
@@ -1221,7 +1221,7 @@
           <w:color w:val="3A3A4A"/>
           <w:sz w:val="28"/>
         </w:rPr>
-        <w:t>Pega los rayos del sol usando stickers de color amarillo.</w:t>
+        <w:t>Nuestro sol con gafas quiere brillar muy fuerte. Pega sus rayos alrededor con stickers de color amarillo y complétalos uno a uno hasta que ilumine todo el cielo. ¡No olvides contarlos mientras los pegas!</w:t>
       </w:r>
     </w:p>
     <w:p>
@@ -1324,7 +1324,7 @@
           <w:color w:val="3A3A4A"/>
           <w:sz w:val="28"/>
         </w:rPr>
-        <w:t>Pega la lluvia debajo de la nube y practica el color azul con tus stickers.</w:t>
+        <w:t>¡Va a llover! Pega las gotitas debajo de la nubecita feliz usando stickers azules y practica este color. Mientras las colocas, cuenta cuántas gotas caen para trabajar también los números.</w:t>
       </w:r>
     </w:p>
     <w:p>
@@ -1335,7 +1335,7 @@
       <w:r>
         <w:drawing>
           <wp:inline xmlns:a="http://schemas.openxmlformats.org/drawingml/2006/main" xmlns:pic="http://schemas.openxmlformats.org/drawingml/2006/picture">
-            <wp:extent cx="5688000" cy="5283148"/>
+            <wp:extent cx="5688000" cy="5416984"/>
             <wp:docPr id="7" name="Picture 7"/>
             <wp:cNvGraphicFramePr>
               <a:graphicFrameLocks noChangeAspect="1"/>
@@ -1356,7 +1356,7 @@
                   <pic:spPr>
                     <a:xfrm>
                       <a:off x="0" y="0"/>
-                      <a:ext cx="5688000" cy="5283148"/>
+                      <a:ext cx="5688000" cy="5416984"/>
                     </a:xfrm>
                     <a:prstGeom prst="rect"/>
                   </pic:spPr>
@@ -1427,7 +1427,7 @@
           <w:color w:val="3A3A4A"/>
           <w:sz w:val="28"/>
         </w:rPr>
-        <w:t>Pon las manzanas rojas en el árbol pegando un sticker en cada círculo.</w:t>
+        <w:t>El árbol ya está listo para dar sus frutos. Pon una manzana roja en cada círculo usando tus stickers y llénalo de color. Trabajamos la coordinación ojo-mano y la conciencia del espacio.</w:t>
       </w:r>
     </w:p>
     <w:p>
@@ -1530,7 +1530,7 @@
           <w:color w:val="3A3A4A"/>
           <w:sz w:val="28"/>
         </w:rPr>
-        <w:t>Completa el cuerpo de cada oruga con stickers del mismo color que su cabecita.</w:t>
+        <w:t>Cada oruga necesita completar su cuerpo. Fíjate muy bien en el color de su cabecita y continúa pegando stickers del mismo color hasta el final. ¡Crearás patrones de colores divertidos!</w:t>
       </w:r>
     </w:p>
     <w:p>
@@ -1633,7 +1633,7 @@
           <w:color w:val="3A3A4A"/>
           <w:sz w:val="28"/>
         </w:rPr>
-        <w:t>Pon un sticker negro en el cuerpo de cada arañita.</w:t>
+        <w:t>Estas simpáticas arañitas perdieron su cuerpo. Pon un sticker negro en el centro de cada una para completarlas y, al terminar, cuéntalas todas para saber cuántas arañitas hay.</w:t>
       </w:r>
     </w:p>
     <w:p>
@@ -1736,7 +1736,7 @@
           <w:color w:val="3A3A4A"/>
           <w:sz w:val="28"/>
         </w:rPr>
-        <w:t>Usa stickers rojos para formar las cerezas.</w:t>
+        <w:t>Forma cada par de cerezas pegando stickers rojos en su lugar. Practicamos el color rojo y el movimiento de pinza de los dedos, tan importante para aprender a escribir más adelante.</w:t>
       </w:r>
     </w:p>
     <w:p>
@@ -1839,7 +1839,7 @@
           <w:color w:val="3A3A4A"/>
           <w:sz w:val="28"/>
         </w:rPr>
-        <w:t>Pega la yema de cada huevo con un sticker amarillo.</w:t>
+        <w:t>A cada huevo le falta su yema. Pega un sticker amarillo justo en el centro de cada uno para terminarlos. ¡Quedarán listos y deliciosos para el desayuno!</w:t>
       </w:r>
     </w:p>
     <w:p>
@@ -1942,7 +1942,7 @@
           <w:color w:val="3A3A4A"/>
           <w:sz w:val="28"/>
         </w:rPr>
-        <w:t>Pega las semillas de la sandía con stickers negros.</w:t>
+        <w:t>Esta sandía está jugosa y fresquita, pero le faltan las semillas. Pégalas con stickers negros y decórala. Al final, cuenta cuántas semillas pusiste en total.</w:t>
       </w:r>
     </w:p>
     <w:p>
@@ -2045,7 +2045,7 @@
           <w:color w:val="3A3A4A"/>
           <w:sz w:val="28"/>
         </w:rPr>
-        <w:t>Decora los pétalos de las flores con stickers de colores.</w:t>
+        <w:t>Decora los pétalos de cada flor con stickers de colores. Puedes seguir un patrón (un color sí y otro no) o crear tu propia combinación. ¡Deja volar tu imaginación y llena el jardín de color!</w:t>
       </w:r>
     </w:p>
     <w:p>
@@ -2148,7 +2148,7 @@
           <w:color w:val="3A3A4A"/>
           <w:sz w:val="28"/>
         </w:rPr>
-        <w:t>Pega stickers de colores sobre cada arco del arcoíris siguiendo sus colores.</w:t>
+        <w:t>Completa el arcoíris pegando stickers de colores sobre cada uno de sus arcos. Respeta el color de cada franja —rojo, amarillo, verde y azul— y haz que brille después de la lluvia.</w:t>
       </w:r>
     </w:p>
     <w:p>
@@ -2159,7 +2159,7 @@
       <w:r>
         <w:drawing>
           <wp:inline xmlns:a="http://schemas.openxmlformats.org/drawingml/2006/main" xmlns:pic="http://schemas.openxmlformats.org/drawingml/2006/picture">
-            <wp:extent cx="5688000" cy="3710584"/>
+            <wp:extent cx="5688000" cy="2844000"/>
             <wp:docPr id="15" name="Picture 15"/>
             <wp:cNvGraphicFramePr>
               <a:graphicFrameLocks noChangeAspect="1"/>
@@ -2180,7 +2180,7 @@
                   <pic:spPr>
                     <a:xfrm>
                       <a:off x="0" y="0"/>
-                      <a:ext cx="5688000" cy="3710584"/>
+                      <a:ext cx="5688000" cy="2844000"/>
                     </a:xfrm>
                     <a:prstGeom prst="rect"/>
                   </pic:spPr>
@@ -2234,6 +2234,315 @@
           <w:color w:val="FF5168"/>
           <w:sz w:val="48"/>
         </w:rPr>
+        <w:t>El semáforo</w:t>
+      </w:r>
+    </w:p>
+    <w:p>
+      <w:pPr>
+        <w:keepNext/>
+        <w:spacing w:before="120" w:after="120" w:line="288" w:lineRule="auto"/>
+        <w:jc w:val="left"/>
+      </w:pPr>
+      <w:r>
+        <w:rPr>
+          <w:rFonts w:ascii="Nunito" w:hAnsi="Nunito" w:cs="Nunito"/>
+          <w:b w:val="0"/>
+          <w:i w:val="0"/>
+          <w:color w:val="3A3A4A"/>
+          <w:sz w:val="28"/>
+        </w:rPr>
+        <w:t>Aprende los colores del semáforo y para qué sirven: pega el sticker rojo arriba, el amarillo en el medio y el verde abajo. Recuerda que el rojo significa parar, el amarillo esperar y el verde avanzar.</w:t>
+      </w:r>
+    </w:p>
+    <w:p>
+      <w:pPr>
+        <w:spacing w:before="80" w:after="80" w:line="240" w:lineRule="auto"/>
+        <w:jc w:val="center"/>
+      </w:pPr>
+      <w:r>
+        <w:drawing>
+          <wp:inline xmlns:a="http://schemas.openxmlformats.org/drawingml/2006/main" xmlns:pic="http://schemas.openxmlformats.org/drawingml/2006/picture">
+            <wp:extent cx="5688000" cy="6286913"/>
+            <wp:docPr id="16" name="Picture 16"/>
+            <wp:cNvGraphicFramePr>
+              <a:graphicFrameLocks noChangeAspect="1"/>
+            </wp:cNvGraphicFramePr>
+            <a:graphic>
+              <a:graphicData uri="http://schemas.openxmlformats.org/drawingml/2006/picture">
+                <pic:pic>
+                  <pic:nvPicPr>
+                    <pic:cNvPr id="0" name="17_semaforo.png"/>
+                    <pic:cNvPicPr/>
+                  </pic:nvPicPr>
+                  <pic:blipFill>
+                    <a:blip r:embed="rId23"/>
+                    <a:stretch>
+                      <a:fillRect/>
+                    </a:stretch>
+                  </pic:blipFill>
+                  <pic:spPr>
+                    <a:xfrm>
+                      <a:off x="0" y="0"/>
+                      <a:ext cx="5688000" cy="6286913"/>
+                    </a:xfrm>
+                    <a:prstGeom prst="rect"/>
+                  </pic:spPr>
+                </pic:pic>
+              </a:graphicData>
+            </a:graphic>
+          </wp:inline>
+        </w:drawing>
+      </w:r>
+    </w:p>
+    <w:p>
+      <w:r>
+        <w:br w:type="page"/>
+      </w:r>
+    </w:p>
+    <w:p>
+      <w:pPr>
+        <w:keepNext/>
+        <w:spacing w:before="0" w:after="40" w:line="283" w:lineRule="auto"/>
+        <w:jc w:val="left"/>
+        <w:pBdr>
+          <w:bottom w:val="single" w:sz="16" w:space="6" w:color="2E8BFF"/>
+        </w:pBdr>
+      </w:pPr>
+      <w:r>
+        <w:rPr>
+          <w:rFonts w:ascii="Fredoka" w:hAnsi="Fredoka" w:cs="Fredoka"/>
+          <w:b/>
+          <w:i w:val="0"/>
+          <w:color w:val="FFFFFF"/>
+          <w:sz w:val="28"/>
+          <w:shd w:val="clear" w:color="auto" w:fill="2E8BFF"/>
+        </w:rPr>
+        <w:t xml:space="preserve">  14  </w:t>
+      </w:r>
+      <w:r>
+        <w:rPr>
+          <w:rFonts w:ascii="Fredoka" w:hAnsi="Fredoka" w:cs="Fredoka"/>
+          <w:b w:val="0"/>
+          <w:i w:val="0"/>
+          <w:color w:val="3A3A4A"/>
+          <w:sz w:val="28"/>
+        </w:rPr>
+        <w:t xml:space="preserve">   </w:t>
+      </w:r>
+      <w:r>
+        <w:rPr>
+          <w:rFonts w:ascii="Fredoka" w:hAnsi="Fredoka" w:cs="Fredoka"/>
+          <w:b/>
+          <w:i w:val="0"/>
+          <w:color w:val="2E8BFF"/>
+          <w:sz w:val="48"/>
+        </w:rPr>
+        <w:t>La mariposa</w:t>
+      </w:r>
+    </w:p>
+    <w:p>
+      <w:pPr>
+        <w:keepNext/>
+        <w:spacing w:before="120" w:after="120" w:line="288" w:lineRule="auto"/>
+        <w:jc w:val="left"/>
+      </w:pPr>
+      <w:r>
+        <w:rPr>
+          <w:rFonts w:ascii="Nunito" w:hAnsi="Nunito" w:cs="Nunito"/>
+          <w:b w:val="0"/>
+          <w:i w:val="0"/>
+          <w:color w:val="3A3A4A"/>
+          <w:sz w:val="28"/>
+        </w:rPr>
+        <w:t>Decora las alas de la mariposa con stickers de colores. El reto es lograr que el lado izquierdo y el derecho queden iguales para descubrir la simetría. ¡Elige tus colores favoritos y hazla volar!</w:t>
+      </w:r>
+    </w:p>
+    <w:p>
+      <w:pPr>
+        <w:spacing w:before="80" w:after="80" w:line="240" w:lineRule="auto"/>
+        <w:jc w:val="center"/>
+      </w:pPr>
+      <w:r>
+        <w:drawing>
+          <wp:inline xmlns:a="http://schemas.openxmlformats.org/drawingml/2006/main" xmlns:pic="http://schemas.openxmlformats.org/drawingml/2006/picture">
+            <wp:extent cx="5688000" cy="5554165"/>
+            <wp:docPr id="17" name="Picture 17"/>
+            <wp:cNvGraphicFramePr>
+              <a:graphicFrameLocks noChangeAspect="1"/>
+            </wp:cNvGraphicFramePr>
+            <a:graphic>
+              <a:graphicData uri="http://schemas.openxmlformats.org/drawingml/2006/picture">
+                <pic:pic>
+                  <pic:nvPicPr>
+                    <pic:cNvPr id="0" name="18_mariposa.png"/>
+                    <pic:cNvPicPr/>
+                  </pic:nvPicPr>
+                  <pic:blipFill>
+                    <a:blip r:embed="rId24"/>
+                    <a:stretch>
+                      <a:fillRect/>
+                    </a:stretch>
+                  </pic:blipFill>
+                  <pic:spPr>
+                    <a:xfrm>
+                      <a:off x="0" y="0"/>
+                      <a:ext cx="5688000" cy="5554165"/>
+                    </a:xfrm>
+                    <a:prstGeom prst="rect"/>
+                  </pic:spPr>
+                </pic:pic>
+              </a:graphicData>
+            </a:graphic>
+          </wp:inline>
+        </w:drawing>
+      </w:r>
+    </w:p>
+    <w:p>
+      <w:r>
+        <w:br w:type="page"/>
+      </w:r>
+    </w:p>
+    <w:p>
+      <w:pPr>
+        <w:keepNext/>
+        <w:spacing w:before="0" w:after="40" w:line="283" w:lineRule="auto"/>
+        <w:jc w:val="left"/>
+        <w:pBdr>
+          <w:bottom w:val="single" w:sz="16" w:space="6" w:color="FF5168"/>
+        </w:pBdr>
+      </w:pPr>
+      <w:r>
+        <w:rPr>
+          <w:rFonts w:ascii="Fredoka" w:hAnsi="Fredoka" w:cs="Fredoka"/>
+          <w:b/>
+          <w:i w:val="0"/>
+          <w:color w:val="FFFFFF"/>
+          <w:sz w:val="28"/>
+          <w:shd w:val="clear" w:color="auto" w:fill="FF5168"/>
+        </w:rPr>
+        <w:t xml:space="preserve">  15  </w:t>
+      </w:r>
+      <w:r>
+        <w:rPr>
+          <w:rFonts w:ascii="Fredoka" w:hAnsi="Fredoka" w:cs="Fredoka"/>
+          <w:b w:val="0"/>
+          <w:i w:val="0"/>
+          <w:color w:val="3A3A4A"/>
+          <w:sz w:val="28"/>
+        </w:rPr>
+        <w:t xml:space="preserve">   </w:t>
+      </w:r>
+      <w:r>
+        <w:rPr>
+          <w:rFonts w:ascii="Fredoka" w:hAnsi="Fredoka" w:cs="Fredoka"/>
+          <w:b/>
+          <w:i w:val="0"/>
+          <w:color w:val="FF5168"/>
+          <w:sz w:val="48"/>
+        </w:rPr>
+        <w:t>La mariquita</w:t>
+      </w:r>
+    </w:p>
+    <w:p>
+      <w:pPr>
+        <w:keepNext/>
+        <w:spacing w:before="120" w:after="120" w:line="288" w:lineRule="auto"/>
+        <w:jc w:val="left"/>
+      </w:pPr>
+      <w:r>
+        <w:rPr>
+          <w:rFonts w:ascii="Nunito" w:hAnsi="Nunito" w:cs="Nunito"/>
+          <w:b w:val="0"/>
+          <w:i w:val="0"/>
+          <w:color w:val="3A3A4A"/>
+          <w:sz w:val="28"/>
+        </w:rPr>
+        <w:t>Esta mariquita necesita sus puntitos para lucir hermosa. Pega stickers negros sobre su espalda roja repartiéndolos a ambos lados y, al terminar, cuéntalos uno por uno.</w:t>
+      </w:r>
+    </w:p>
+    <w:p>
+      <w:pPr>
+        <w:spacing w:before="80" w:after="80" w:line="240" w:lineRule="auto"/>
+        <w:jc w:val="center"/>
+      </w:pPr>
+      <w:r>
+        <w:drawing>
+          <wp:inline xmlns:a="http://schemas.openxmlformats.org/drawingml/2006/main" xmlns:pic="http://schemas.openxmlformats.org/drawingml/2006/picture">
+            <wp:extent cx="5688000" cy="5119200"/>
+            <wp:docPr id="18" name="Picture 18"/>
+            <wp:cNvGraphicFramePr>
+              <a:graphicFrameLocks noChangeAspect="1"/>
+            </wp:cNvGraphicFramePr>
+            <a:graphic>
+              <a:graphicData uri="http://schemas.openxmlformats.org/drawingml/2006/picture">
+                <pic:pic>
+                  <pic:nvPicPr>
+                    <pic:cNvPr id="0" name="19_mariquita.png"/>
+                    <pic:cNvPicPr/>
+                  </pic:nvPicPr>
+                  <pic:blipFill>
+                    <a:blip r:embed="rId25"/>
+                    <a:stretch>
+                      <a:fillRect/>
+                    </a:stretch>
+                  </pic:blipFill>
+                  <pic:spPr>
+                    <a:xfrm>
+                      <a:off x="0" y="0"/>
+                      <a:ext cx="5688000" cy="5119200"/>
+                    </a:xfrm>
+                    <a:prstGeom prst="rect"/>
+                  </pic:spPr>
+                </pic:pic>
+              </a:graphicData>
+            </a:graphic>
+          </wp:inline>
+        </w:drawing>
+      </w:r>
+    </w:p>
+    <w:p>
+      <w:r>
+        <w:br w:type="page"/>
+      </w:r>
+    </w:p>
+    <w:p>
+      <w:pPr>
+        <w:keepNext/>
+        <w:spacing w:before="0" w:after="40" w:line="283" w:lineRule="auto"/>
+        <w:jc w:val="left"/>
+        <w:pBdr>
+          <w:bottom w:val="single" w:sz="16" w:space="6" w:color="F0B021"/>
+        </w:pBdr>
+      </w:pPr>
+      <w:r>
+        <w:rPr>
+          <w:rFonts w:ascii="Fredoka" w:hAnsi="Fredoka" w:cs="Fredoka"/>
+          <w:b/>
+          <w:i w:val="0"/>
+          <w:color w:val="FFFFFF"/>
+          <w:sz w:val="28"/>
+          <w:shd w:val="clear" w:color="auto" w:fill="F0B021"/>
+        </w:rPr>
+        <w:t xml:space="preserve">  16  </w:t>
+      </w:r>
+      <w:r>
+        <w:rPr>
+          <w:rFonts w:ascii="Fredoka" w:hAnsi="Fredoka" w:cs="Fredoka"/>
+          <w:b w:val="0"/>
+          <w:i w:val="0"/>
+          <w:color w:val="3A3A4A"/>
+          <w:sz w:val="28"/>
+        </w:rPr>
+        <w:t xml:space="preserve">   </w:t>
+      </w:r>
+      <w:r>
+        <w:rPr>
+          <w:rFonts w:ascii="Fredoka" w:hAnsi="Fredoka" w:cs="Fredoka"/>
+          <w:b/>
+          <w:i w:val="0"/>
+          <w:color w:val="F0B021"/>
+          <w:sz w:val="48"/>
+        </w:rPr>
         <w:t>Muchos y pocos</w:t>
       </w:r>
     </w:p>
@@ -2251,7 +2560,7 @@
           <w:color w:val="3A3A4A"/>
           <w:sz w:val="28"/>
         </w:rPr>
-        <w:t>Llena un frasco con pocos stickers y el otro con muchos. ¡Aprende las cantidades!</w:t>
+        <w:t>Mira los frascos de ejemplo: uno tiene pocos stickers y el otro tiene muchos. Ahora llena tú los frascos vacíos: uno con pocos y otro con muchos. Así aprendemos las cantidades y comparamos dónde hay más y dónde hay menos.</w:t>
       </w:r>
     </w:p>
     <w:p>
@@ -2263,7 +2572,7 @@
         <w:drawing>
           <wp:inline xmlns:a="http://schemas.openxmlformats.org/drawingml/2006/main" xmlns:pic="http://schemas.openxmlformats.org/drawingml/2006/picture">
             <wp:extent cx="5688000" cy="5309915"/>
-            <wp:docPr id="16" name="Picture 16"/>
+            <wp:docPr id="19" name="Picture 19"/>
             <wp:cNvGraphicFramePr>
               <a:graphicFrameLocks noChangeAspect="1"/>
             </wp:cNvGraphicFramePr>
@@ -2275,7 +2584,7 @@
                     <pic:cNvPicPr/>
                   </pic:nvPicPr>
                   <pic:blipFill>
-                    <a:blip r:embed="rId23"/>
+                    <a:blip r:embed="rId26"/>
                     <a:stretch>
                       <a:fillRect/>
                     </a:stretch>

</xml_diff>

<commit_message>
Improve butterfly and ladybug illustrations
- Butterfly: real wing silhouettes (mirrored for perfect symmetry),
  segmented abdomen, cute face and club antennae.
- Ladybug: rounder, friendlier body with dome head, eyes, antennae and
  six properly bent legs.
- Re-render assets, rebuild DOCX (fonts re-embedded) and PDF.

Co-authored-by: hectorrios-ui <hectorrios-ui@users.noreply.github.com>
</commit_message>
<xml_diff>
--- a/libro-stickers-digital/Libro_Actividades_Stickers_Mi_Dulce_Emma.docx
+++ b/libro-stickers-digital/Libro_Actividades_Stickers_Mi_Dulce_Emma.docx
@@ -2365,7 +2365,7 @@
       <w:r>
         <w:drawing>
           <wp:inline xmlns:a="http://schemas.openxmlformats.org/drawingml/2006/main" xmlns:pic="http://schemas.openxmlformats.org/drawingml/2006/picture">
-            <wp:extent cx="5688000" cy="5554165"/>
+            <wp:extent cx="5688000" cy="5055628"/>
             <wp:docPr id="17" name="Picture 17"/>
             <wp:cNvGraphicFramePr>
               <a:graphicFrameLocks noChangeAspect="1"/>
@@ -2386,7 +2386,7 @@
                   <pic:spPr>
                     <a:xfrm>
                       <a:off x="0" y="0"/>
-                      <a:ext cx="5688000" cy="5554165"/>
+                      <a:ext cx="5688000" cy="5055628"/>
                     </a:xfrm>
                     <a:prstGeom prst="rect"/>
                   </pic:spPr>
@@ -2468,7 +2468,7 @@
       <w:r>
         <w:drawing>
           <wp:inline xmlns:a="http://schemas.openxmlformats.org/drawingml/2006/main" xmlns:pic="http://schemas.openxmlformats.org/drawingml/2006/picture">
-            <wp:extent cx="5688000" cy="5119200"/>
+            <wp:extent cx="5688000" cy="5550819"/>
             <wp:docPr id="18" name="Picture 18"/>
             <wp:cNvGraphicFramePr>
               <a:graphicFrameLocks noChangeAspect="1"/>
@@ -2489,7 +2489,7 @@
                   <pic:spPr>
                     <a:xfrm>
                       <a:off x="0" y="0"/>
-                      <a:ext cx="5688000" cy="5119200"/>
+                      <a:ext cx="5688000" cy="5550819"/>
                     </a:xfrm>
                     <a:prstGeom prst="rect"/>
                   </pic:spPr>

</xml_diff>

<commit_message>
Add ice cream (sprinkles) and ladybug counting activities
- New 'Helado de chispas': big two-scoop ice cream with waffle cone (clipped
  crosshatch) and sprinkle sticker slots over both scoops.
- New 'A contar mariquitas': six ladybugs with 1..6 spots and numbered badges
  to practice counting. Refactor ladybug into a reusable function.
- Integrate both into the DOCX with expanded descriptions; book is now 21
  pages. Re-embed fonts and rebuild PDF.

Co-authored-by: hectorrios-ui <hectorrios-ui@users.noreply.github.com>
</commit_message>
<xml_diff>
--- a/libro-stickers-digital/Libro_Actividades_Stickers_Mi_Dulce_Emma.docx
+++ b/libro-stickers-digital/Libro_Actividades_Stickers_Mi_Dulce_Emma.docx
@@ -2511,6 +2511,212 @@
         <w:spacing w:before="0" w:after="40" w:line="283" w:lineRule="auto"/>
         <w:jc w:val="left"/>
         <w:pBdr>
+          <w:bottom w:val="single" w:sz="16" w:space="6" w:color="FF5168"/>
+        </w:pBdr>
+      </w:pPr>
+      <w:r>
+        <w:rPr>
+          <w:rFonts w:ascii="Fredoka" w:hAnsi="Fredoka" w:cs="Fredoka"/>
+          <w:b/>
+          <w:i w:val="0"/>
+          <w:color w:val="FFFFFF"/>
+          <w:sz w:val="28"/>
+          <w:shd w:val="clear" w:color="auto" w:fill="FF5168"/>
+        </w:rPr>
+        <w:t xml:space="preserve">  16  </w:t>
+      </w:r>
+      <w:r>
+        <w:rPr>
+          <w:rFonts w:ascii="Fredoka" w:hAnsi="Fredoka" w:cs="Fredoka"/>
+          <w:b w:val="0"/>
+          <w:i w:val="0"/>
+          <w:color w:val="3A3A4A"/>
+          <w:sz w:val="28"/>
+        </w:rPr>
+        <w:t xml:space="preserve">   </w:t>
+      </w:r>
+      <w:r>
+        <w:rPr>
+          <w:rFonts w:ascii="Fredoka" w:hAnsi="Fredoka" w:cs="Fredoka"/>
+          <w:b/>
+          <w:i w:val="0"/>
+          <w:color w:val="FF5168"/>
+          <w:sz w:val="48"/>
+        </w:rPr>
+        <w:t>A contar mariquitas</w:t>
+      </w:r>
+    </w:p>
+    <w:p>
+      <w:pPr>
+        <w:keepNext/>
+        <w:spacing w:before="120" w:after="120" w:line="288" w:lineRule="auto"/>
+        <w:jc w:val="left"/>
+      </w:pPr>
+      <w:r>
+        <w:rPr>
+          <w:rFonts w:ascii="Nunito" w:hAnsi="Nunito" w:cs="Nunito"/>
+          <w:b w:val="0"/>
+          <w:i w:val="0"/>
+          <w:color w:val="3A3A4A"/>
+          <w:sz w:val="28"/>
+        </w:rPr>
+        <w:t>Aquí tienes seis mariquitas y cada una lleva su número. Pega tantas manchas negras como indique cada una: 1 mancha a la primera, 2 a la segunda, 3 a la tercera… y así hasta llegar a 6. Cuenta en voz alta mientras las colocas para practicar los números y la correspondencia.</w:t>
+      </w:r>
+    </w:p>
+    <w:p>
+      <w:pPr>
+        <w:spacing w:before="80" w:after="80" w:line="240" w:lineRule="auto"/>
+        <w:jc w:val="center"/>
+      </w:pPr>
+      <w:r>
+        <w:drawing>
+          <wp:inline xmlns:a="http://schemas.openxmlformats.org/drawingml/2006/main" xmlns:pic="http://schemas.openxmlformats.org/drawingml/2006/picture">
+            <wp:extent cx="5688000" cy="4684235"/>
+            <wp:docPr id="19" name="Picture 19"/>
+            <wp:cNvGraphicFramePr>
+              <a:graphicFrameLocks noChangeAspect="1"/>
+            </wp:cNvGraphicFramePr>
+            <a:graphic>
+              <a:graphicData uri="http://schemas.openxmlformats.org/drawingml/2006/picture">
+                <pic:pic>
+                  <pic:nvPicPr>
+                    <pic:cNvPr id="0" name="21_mariquitas_conteo.png"/>
+                    <pic:cNvPicPr/>
+                  </pic:nvPicPr>
+                  <pic:blipFill>
+                    <a:blip r:embed="rId26"/>
+                    <a:stretch>
+                      <a:fillRect/>
+                    </a:stretch>
+                  </pic:blipFill>
+                  <pic:spPr>
+                    <a:xfrm>
+                      <a:off x="0" y="0"/>
+                      <a:ext cx="5688000" cy="4684235"/>
+                    </a:xfrm>
+                    <a:prstGeom prst="rect"/>
+                  </pic:spPr>
+                </pic:pic>
+              </a:graphicData>
+            </a:graphic>
+          </wp:inline>
+        </w:drawing>
+      </w:r>
+    </w:p>
+    <w:p>
+      <w:r>
+        <w:br w:type="page"/>
+      </w:r>
+    </w:p>
+    <w:p>
+      <w:pPr>
+        <w:keepNext/>
+        <w:spacing w:before="0" w:after="40" w:line="283" w:lineRule="auto"/>
+        <w:jc w:val="left"/>
+        <w:pBdr>
+          <w:bottom w:val="single" w:sz="16" w:space="6" w:color="22A455"/>
+        </w:pBdr>
+      </w:pPr>
+      <w:r>
+        <w:rPr>
+          <w:rFonts w:ascii="Fredoka" w:hAnsi="Fredoka" w:cs="Fredoka"/>
+          <w:b/>
+          <w:i w:val="0"/>
+          <w:color w:val="FFFFFF"/>
+          <w:sz w:val="28"/>
+          <w:shd w:val="clear" w:color="auto" w:fill="22A455"/>
+        </w:rPr>
+        <w:t xml:space="preserve">  17  </w:t>
+      </w:r>
+      <w:r>
+        <w:rPr>
+          <w:rFonts w:ascii="Fredoka" w:hAnsi="Fredoka" w:cs="Fredoka"/>
+          <w:b w:val="0"/>
+          <w:i w:val="0"/>
+          <w:color w:val="3A3A4A"/>
+          <w:sz w:val="28"/>
+        </w:rPr>
+        <w:t xml:space="preserve">   </w:t>
+      </w:r>
+      <w:r>
+        <w:rPr>
+          <w:rFonts w:ascii="Fredoka" w:hAnsi="Fredoka" w:cs="Fredoka"/>
+          <w:b/>
+          <w:i w:val="0"/>
+          <w:color w:val="22A455"/>
+          <w:sz w:val="48"/>
+        </w:rPr>
+        <w:t>Helado de chispas</w:t>
+      </w:r>
+    </w:p>
+    <w:p>
+      <w:pPr>
+        <w:keepNext/>
+        <w:spacing w:before="120" w:after="120" w:line="288" w:lineRule="auto"/>
+        <w:jc w:val="left"/>
+      </w:pPr>
+      <w:r>
+        <w:rPr>
+          <w:rFonts w:ascii="Nunito" w:hAnsi="Nunito" w:cs="Nunito"/>
+          <w:b w:val="0"/>
+          <w:i w:val="0"/>
+          <w:color w:val="3A3A4A"/>
+          <w:sz w:val="28"/>
+        </w:rPr>
+        <w:t>¡Qué rico helado! Decóralo con chispas de colores: pega un sticker en cada puntito de las bolas. Combina los colores como más te gusten y trabaja la motricidad fina colocando cada chispita en su lugar.</w:t>
+      </w:r>
+    </w:p>
+    <w:p>
+      <w:pPr>
+        <w:spacing w:before="80" w:after="80" w:line="240" w:lineRule="auto"/>
+        <w:jc w:val="center"/>
+      </w:pPr>
+      <w:r>
+        <w:drawing>
+          <wp:inline xmlns:a="http://schemas.openxmlformats.org/drawingml/2006/main" xmlns:pic="http://schemas.openxmlformats.org/drawingml/2006/picture">
+            <wp:extent cx="4885714" cy="6840000"/>
+            <wp:docPr id="20" name="Picture 20"/>
+            <wp:cNvGraphicFramePr>
+              <a:graphicFrameLocks noChangeAspect="1"/>
+            </wp:cNvGraphicFramePr>
+            <a:graphic>
+              <a:graphicData uri="http://schemas.openxmlformats.org/drawingml/2006/picture">
+                <pic:pic>
+                  <pic:nvPicPr>
+                    <pic:cNvPr id="0" name="20_helado.png"/>
+                    <pic:cNvPicPr/>
+                  </pic:nvPicPr>
+                  <pic:blipFill>
+                    <a:blip r:embed="rId27"/>
+                    <a:stretch>
+                      <a:fillRect/>
+                    </a:stretch>
+                  </pic:blipFill>
+                  <pic:spPr>
+                    <a:xfrm>
+                      <a:off x="0" y="0"/>
+                      <a:ext cx="4885714" cy="6840000"/>
+                    </a:xfrm>
+                    <a:prstGeom prst="rect"/>
+                  </pic:spPr>
+                </pic:pic>
+              </a:graphicData>
+            </a:graphic>
+          </wp:inline>
+        </w:drawing>
+      </w:r>
+    </w:p>
+    <w:p>
+      <w:r>
+        <w:br w:type="page"/>
+      </w:r>
+    </w:p>
+    <w:p>
+      <w:pPr>
+        <w:keepNext/>
+        <w:spacing w:before="0" w:after="40" w:line="283" w:lineRule="auto"/>
+        <w:jc w:val="left"/>
+        <w:pBdr>
           <w:bottom w:val="single" w:sz="16" w:space="6" w:color="F0B021"/>
         </w:pBdr>
       </w:pPr>
@@ -2523,7 +2729,7 @@
           <w:sz w:val="28"/>
           <w:shd w:val="clear" w:color="auto" w:fill="F0B021"/>
         </w:rPr>
-        <w:t xml:space="preserve">  16  </w:t>
+        <w:t xml:space="preserve">  18  </w:t>
       </w:r>
       <w:r>
         <w:rPr>
@@ -2572,7 +2778,7 @@
         <w:drawing>
           <wp:inline xmlns:a="http://schemas.openxmlformats.org/drawingml/2006/main" xmlns:pic="http://schemas.openxmlformats.org/drawingml/2006/picture">
             <wp:extent cx="5688000" cy="5309915"/>
-            <wp:docPr id="19" name="Picture 19"/>
+            <wp:docPr id="21" name="Picture 21"/>
             <wp:cNvGraphicFramePr>
               <a:graphicFrameLocks noChangeAspect="1"/>
             </wp:cNvGraphicFramePr>
@@ -2584,7 +2790,7 @@
                     <pic:cNvPicPr/>
                   </pic:nvPicPr>
                   <pic:blipFill>
-                    <a:blip r:embed="rId26"/>
+                    <a:blip r:embed="rId28"/>
                     <a:stretch>
                       <a:fillRect/>
                     </a:stretch>

</xml_diff>

<commit_message>
Switch to Letter (Carta) size and homologate all stickers to 16 mm
- Page size changed from A4 to Letter (Carta, 21.59x27.94 cm), the standard
  in Colombia.
- Fixed common physical scale (0.20 mm/unit, slot r=40) so every sticker slot
  prints at exactly 16 mm; illustrations re-sized/re-spaced accordingly and
  each image is placed at its real physical width in the DOCX.
- Hearts activity now has 6 hearts (added green, purple, orange).
- Counting ladybugs (1-6) split across two pages so the 16 mm spots fit; fixed
  an empty continuation page via page-break-before.
- Re-embed fonts and rebuild PDF (22 pages).

Co-authored-by: hectorrios-ui <hectorrios-ui@users.noreply.github.com>
</commit_message>
<xml_diff>
--- a/libro-stickers-digital/Libro_Actividades_Stickers_Mi_Dulce_Emma.docx
+++ b/libro-stickers-digital/Libro_Actividades_Stickers_Mi_Dulce_Emma.docx
@@ -1026,7 +1026,7 @@
       <w:r>
         <w:drawing>
           <wp:inline xmlns:a="http://schemas.openxmlformats.org/drawingml/2006/main" xmlns:pic="http://schemas.openxmlformats.org/drawingml/2006/picture">
-            <wp:extent cx="5688000" cy="4235887"/>
+            <wp:extent cx="6263999" cy="5040677"/>
             <wp:docPr id="4" name="Picture 4"/>
             <wp:cNvGraphicFramePr>
               <a:graphicFrameLocks noChangeAspect="1"/>
@@ -1047,7 +1047,7 @@
                   <pic:spPr>
                     <a:xfrm>
                       <a:off x="0" y="0"/>
-                      <a:ext cx="5688000" cy="4235887"/>
+                      <a:ext cx="6263999" cy="5040677"/>
                     </a:xfrm>
                     <a:prstGeom prst="rect"/>
                   </pic:spPr>
@@ -1129,7 +1129,7 @@
       <w:r>
         <w:drawing>
           <wp:inline xmlns:a="http://schemas.openxmlformats.org/drawingml/2006/main" xmlns:pic="http://schemas.openxmlformats.org/drawingml/2006/picture">
-            <wp:extent cx="5688000" cy="4423256"/>
+            <wp:extent cx="6336000" cy="5184339"/>
             <wp:docPr id="5" name="Picture 5"/>
             <wp:cNvGraphicFramePr>
               <a:graphicFrameLocks noChangeAspect="1"/>
@@ -1150,7 +1150,7 @@
                   <pic:spPr>
                     <a:xfrm>
                       <a:off x="0" y="0"/>
-                      <a:ext cx="5688000" cy="4423256"/>
+                      <a:ext cx="6336000" cy="5184339"/>
                     </a:xfrm>
                     <a:prstGeom prst="rect"/>
                   </pic:spPr>
@@ -1232,7 +1232,7 @@
       <w:r>
         <w:drawing>
           <wp:inline xmlns:a="http://schemas.openxmlformats.org/drawingml/2006/main" xmlns:pic="http://schemas.openxmlformats.org/drawingml/2006/picture">
-            <wp:extent cx="5688000" cy="5838565"/>
+            <wp:extent cx="4752000" cy="5327831"/>
             <wp:docPr id="6" name="Picture 6"/>
             <wp:cNvGraphicFramePr>
               <a:graphicFrameLocks noChangeAspect="1"/>
@@ -1253,7 +1253,7 @@
                   <pic:spPr>
                     <a:xfrm>
                       <a:off x="0" y="0"/>
-                      <a:ext cx="5688000" cy="5838565"/>
+                      <a:ext cx="4752000" cy="5327831"/>
                     </a:xfrm>
                     <a:prstGeom prst="rect"/>
                   </pic:spPr>
@@ -1335,7 +1335,7 @@
       <w:r>
         <w:drawing>
           <wp:inline xmlns:a="http://schemas.openxmlformats.org/drawingml/2006/main" xmlns:pic="http://schemas.openxmlformats.org/drawingml/2006/picture">
-            <wp:extent cx="5688000" cy="5416984"/>
+            <wp:extent cx="5184000" cy="5903661"/>
             <wp:docPr id="7" name="Picture 7"/>
             <wp:cNvGraphicFramePr>
               <a:graphicFrameLocks noChangeAspect="1"/>
@@ -1356,7 +1356,7 @@
                   <pic:spPr>
                     <a:xfrm>
                       <a:off x="0" y="0"/>
-                      <a:ext cx="5688000" cy="5416984"/>
+                      <a:ext cx="5184000" cy="5903661"/>
                     </a:xfrm>
                     <a:prstGeom prst="rect"/>
                   </pic:spPr>
@@ -1438,7 +1438,7 @@
       <w:r>
         <w:drawing>
           <wp:inline xmlns:a="http://schemas.openxmlformats.org/drawingml/2006/main" xmlns:pic="http://schemas.openxmlformats.org/drawingml/2006/picture">
-            <wp:extent cx="5688000" cy="6136348"/>
+            <wp:extent cx="5472000" cy="5903322"/>
             <wp:docPr id="8" name="Picture 8"/>
             <wp:cNvGraphicFramePr>
               <a:graphicFrameLocks noChangeAspect="1"/>
@@ -1459,7 +1459,7 @@
                   <pic:spPr>
                     <a:xfrm>
                       <a:off x="0" y="0"/>
-                      <a:ext cx="5688000" cy="6136348"/>
+                      <a:ext cx="5472000" cy="5903322"/>
                     </a:xfrm>
                     <a:prstGeom prst="rect"/>
                   </pic:spPr>
@@ -1541,7 +1541,7 @@
       <w:r>
         <w:drawing>
           <wp:inline xmlns:a="http://schemas.openxmlformats.org/drawingml/2006/main" xmlns:pic="http://schemas.openxmlformats.org/drawingml/2006/picture">
-            <wp:extent cx="5091068" cy="6840000"/>
+            <wp:extent cx="4464000" cy="6191831"/>
             <wp:docPr id="9" name="Picture 9"/>
             <wp:cNvGraphicFramePr>
               <a:graphicFrameLocks noChangeAspect="1"/>
@@ -1562,7 +1562,7 @@
                   <pic:spPr>
                     <a:xfrm>
                       <a:off x="0" y="0"/>
-                      <a:ext cx="5091068" cy="6840000"/>
+                      <a:ext cx="4464000" cy="6191831"/>
                     </a:xfrm>
                     <a:prstGeom prst="rect"/>
                   </pic:spPr>
@@ -1644,7 +1644,7 @@
       <w:r>
         <w:drawing>
           <wp:inline xmlns:a="http://schemas.openxmlformats.org/drawingml/2006/main" xmlns:pic="http://schemas.openxmlformats.org/drawingml/2006/picture">
-            <wp:extent cx="5688000" cy="6343793"/>
+            <wp:extent cx="6192000" cy="6625440"/>
             <wp:docPr id="10" name="Picture 10"/>
             <wp:cNvGraphicFramePr>
               <a:graphicFrameLocks noChangeAspect="1"/>
@@ -1665,7 +1665,7 @@
                   <pic:spPr>
                     <a:xfrm>
                       <a:off x="0" y="0"/>
-                      <a:ext cx="5688000" cy="6343793"/>
+                      <a:ext cx="6192000" cy="6625440"/>
                     </a:xfrm>
                     <a:prstGeom prst="rect"/>
                   </pic:spPr>
@@ -1747,7 +1747,7 @@
       <w:r>
         <w:drawing>
           <wp:inline xmlns:a="http://schemas.openxmlformats.org/drawingml/2006/main" xmlns:pic="http://schemas.openxmlformats.org/drawingml/2006/picture">
-            <wp:extent cx="5688000" cy="5550819"/>
+            <wp:extent cx="5472000" cy="5758475"/>
             <wp:docPr id="11" name="Picture 11"/>
             <wp:cNvGraphicFramePr>
               <a:graphicFrameLocks noChangeAspect="1"/>
@@ -1768,7 +1768,7 @@
                   <pic:spPr>
                     <a:xfrm>
                       <a:off x="0" y="0"/>
-                      <a:ext cx="5688000" cy="5550819"/>
+                      <a:ext cx="5472000" cy="5758475"/>
                     </a:xfrm>
                     <a:prstGeom prst="rect"/>
                   </pic:spPr>
@@ -1850,7 +1850,7 @@
       <w:r>
         <w:drawing>
           <wp:inline xmlns:a="http://schemas.openxmlformats.org/drawingml/2006/main" xmlns:pic="http://schemas.openxmlformats.org/drawingml/2006/picture">
-            <wp:extent cx="5688000" cy="4854875"/>
+            <wp:extent cx="5903999" cy="5039237"/>
             <wp:docPr id="12" name="Picture 12"/>
             <wp:cNvGraphicFramePr>
               <a:graphicFrameLocks noChangeAspect="1"/>
@@ -1871,7 +1871,7 @@
                   <pic:spPr>
                     <a:xfrm>
                       <a:off x="0" y="0"/>
-                      <a:ext cx="5688000" cy="4854875"/>
+                      <a:ext cx="5903999" cy="5039237"/>
                     </a:xfrm>
                     <a:prstGeom prst="rect"/>
                   </pic:spPr>
@@ -1953,7 +1953,7 @@
       <w:r>
         <w:drawing>
           <wp:inline xmlns:a="http://schemas.openxmlformats.org/drawingml/2006/main" xmlns:pic="http://schemas.openxmlformats.org/drawingml/2006/picture">
-            <wp:extent cx="5688000" cy="4690927"/>
+            <wp:extent cx="5760000" cy="4896000"/>
             <wp:docPr id="13" name="Picture 13"/>
             <wp:cNvGraphicFramePr>
               <a:graphicFrameLocks noChangeAspect="1"/>
@@ -1974,7 +1974,7 @@
                   <pic:spPr>
                     <a:xfrm>
                       <a:off x="0" y="0"/>
-                      <a:ext cx="5688000" cy="4690927"/>
+                      <a:ext cx="5760000" cy="4896000"/>
                     </a:xfrm>
                     <a:prstGeom prst="rect"/>
                   </pic:spPr>
@@ -2056,7 +2056,7 @@
       <w:r>
         <w:drawing>
           <wp:inline xmlns:a="http://schemas.openxmlformats.org/drawingml/2006/main" xmlns:pic="http://schemas.openxmlformats.org/drawingml/2006/picture">
-            <wp:extent cx="5688000" cy="5169388"/>
+            <wp:extent cx="6336000" cy="5471322"/>
             <wp:docPr id="14" name="Picture 14"/>
             <wp:cNvGraphicFramePr>
               <a:graphicFrameLocks noChangeAspect="1"/>
@@ -2077,7 +2077,7 @@
                   <pic:spPr>
                     <a:xfrm>
                       <a:off x="0" y="0"/>
-                      <a:ext cx="5688000" cy="5169388"/>
+                      <a:ext cx="6336000" cy="5471322"/>
                     </a:xfrm>
                     <a:prstGeom prst="rect"/>
                   </pic:spPr>
@@ -2159,7 +2159,7 @@
       <w:r>
         <w:drawing>
           <wp:inline xmlns:a="http://schemas.openxmlformats.org/drawingml/2006/main" xmlns:pic="http://schemas.openxmlformats.org/drawingml/2006/picture">
-            <wp:extent cx="5688000" cy="2844000"/>
+            <wp:extent cx="6336000" cy="4465016"/>
             <wp:docPr id="15" name="Picture 15"/>
             <wp:cNvGraphicFramePr>
               <a:graphicFrameLocks noChangeAspect="1"/>
@@ -2180,7 +2180,7 @@
                   <pic:spPr>
                     <a:xfrm>
                       <a:off x="0" y="0"/>
-                      <a:ext cx="5688000" cy="2844000"/>
+                      <a:ext cx="6336000" cy="4465016"/>
                     </a:xfrm>
                     <a:prstGeom prst="rect"/>
                   </pic:spPr>
@@ -2262,7 +2262,7 @@
       <w:r>
         <w:drawing>
           <wp:inline xmlns:a="http://schemas.openxmlformats.org/drawingml/2006/main" xmlns:pic="http://schemas.openxmlformats.org/drawingml/2006/picture">
-            <wp:extent cx="5688000" cy="6286913"/>
+            <wp:extent cx="4320000" cy="5903153"/>
             <wp:docPr id="16" name="Picture 16"/>
             <wp:cNvGraphicFramePr>
               <a:graphicFrameLocks noChangeAspect="1"/>
@@ -2283,7 +2283,7 @@
                   <pic:spPr>
                     <a:xfrm>
                       <a:off x="0" y="0"/>
-                      <a:ext cx="5688000" cy="6286913"/>
+                      <a:ext cx="4320000" cy="5903153"/>
                     </a:xfrm>
                     <a:prstGeom prst="rect"/>
                   </pic:spPr>
@@ -2365,7 +2365,7 @@
       <w:r>
         <w:drawing>
           <wp:inline xmlns:a="http://schemas.openxmlformats.org/drawingml/2006/main" xmlns:pic="http://schemas.openxmlformats.org/drawingml/2006/picture">
-            <wp:extent cx="5688000" cy="5055628"/>
+            <wp:extent cx="6336000" cy="5758306"/>
             <wp:docPr id="17" name="Picture 17"/>
             <wp:cNvGraphicFramePr>
               <a:graphicFrameLocks noChangeAspect="1"/>
@@ -2386,7 +2386,7 @@
                   <pic:spPr>
                     <a:xfrm>
                       <a:off x="0" y="0"/>
-                      <a:ext cx="5688000" cy="5055628"/>
+                      <a:ext cx="6336000" cy="5758306"/>
                     </a:xfrm>
                     <a:prstGeom prst="rect"/>
                   </pic:spPr>
@@ -2468,7 +2468,7 @@
       <w:r>
         <w:drawing>
           <wp:inline xmlns:a="http://schemas.openxmlformats.org/drawingml/2006/main" xmlns:pic="http://schemas.openxmlformats.org/drawingml/2006/picture">
-            <wp:extent cx="5688000" cy="5550819"/>
+            <wp:extent cx="5903999" cy="5761608"/>
             <wp:docPr id="18" name="Picture 18"/>
             <wp:cNvGraphicFramePr>
               <a:graphicFrameLocks noChangeAspect="1"/>
@@ -2489,7 +2489,7 @@
                   <pic:spPr>
                     <a:xfrm>
                       <a:off x="0" y="0"/>
-                      <a:ext cx="5688000" cy="5550819"/>
+                      <a:ext cx="5903999" cy="5761608"/>
                     </a:xfrm>
                     <a:prstGeom prst="rect"/>
                   </pic:spPr>
@@ -2571,7 +2571,7 @@
       <w:r>
         <w:drawing>
           <wp:inline xmlns:a="http://schemas.openxmlformats.org/drawingml/2006/main" xmlns:pic="http://schemas.openxmlformats.org/drawingml/2006/picture">
-            <wp:extent cx="5688000" cy="4684235"/>
+            <wp:extent cx="6192000" cy="7055238"/>
             <wp:docPr id="19" name="Picture 19"/>
             <wp:cNvGraphicFramePr>
               <a:graphicFrameLocks noChangeAspect="1"/>
@@ -2580,7 +2580,7 @@
               <a:graphicData uri="http://schemas.openxmlformats.org/drawingml/2006/picture">
                 <pic:pic>
                   <pic:nvPicPr>
-                    <pic:cNvPr id="0" name="21_mariquitas_conteo.png"/>
+                    <pic:cNvPr id="0" name="21_conteo_a.png"/>
                     <pic:cNvPicPr/>
                   </pic:nvPicPr>
                   <pic:blipFill>
@@ -2592,7 +2592,65 @@
                   <pic:spPr>
                     <a:xfrm>
                       <a:off x="0" y="0"/>
-                      <a:ext cx="5688000" cy="4684235"/>
+                      <a:ext cx="6192000" cy="7055238"/>
+                    </a:xfrm>
+                    <a:prstGeom prst="rect"/>
+                  </pic:spPr>
+                </pic:pic>
+              </a:graphicData>
+            </a:graphic>
+          </wp:inline>
+        </w:drawing>
+      </w:r>
+    </w:p>
+    <w:p>
+      <w:pPr>
+        <w:keepNext/>
+        <w:pageBreakBefore/>
+        <w:spacing w:before="0" w:after="120" w:line="288" w:lineRule="auto"/>
+        <w:jc w:val="left"/>
+      </w:pPr>
+      <w:r>
+        <w:rPr>
+          <w:rFonts w:ascii="Fredoka" w:hAnsi="Fredoka" w:cs="Fredoka"/>
+          <w:b/>
+          <w:i w:val="0"/>
+          <w:color w:val="FF5168"/>
+          <w:sz w:val="32"/>
+        </w:rPr>
+        <w:t>A contar mariquitas (continuación)</w:t>
+      </w:r>
+    </w:p>
+    <w:p>
+      <w:pPr>
+        <w:spacing w:before="80" w:after="80" w:line="240" w:lineRule="auto"/>
+        <w:jc w:val="center"/>
+      </w:pPr>
+      <w:r>
+        <w:drawing>
+          <wp:inline xmlns:a="http://schemas.openxmlformats.org/drawingml/2006/main" xmlns:pic="http://schemas.openxmlformats.org/drawingml/2006/picture">
+            <wp:extent cx="6192000" cy="7055238"/>
+            <wp:docPr id="20" name="Picture 20"/>
+            <wp:cNvGraphicFramePr>
+              <a:graphicFrameLocks noChangeAspect="1"/>
+            </wp:cNvGraphicFramePr>
+            <a:graphic>
+              <a:graphicData uri="http://schemas.openxmlformats.org/drawingml/2006/picture">
+                <pic:pic>
+                  <pic:nvPicPr>
+                    <pic:cNvPr id="0" name="21_conteo_b.png"/>
+                    <pic:cNvPicPr/>
+                  </pic:nvPicPr>
+                  <pic:blipFill>
+                    <a:blip r:embed="rId27"/>
+                    <a:stretch>
+                      <a:fillRect/>
+                    </a:stretch>
+                  </pic:blipFill>
+                  <pic:spPr>
+                    <a:xfrm>
+                      <a:off x="0" y="0"/>
+                      <a:ext cx="6192000" cy="7055238"/>
                     </a:xfrm>
                     <a:prstGeom prst="rect"/>
                   </pic:spPr>
@@ -2674,8 +2732,8 @@
       <w:r>
         <w:drawing>
           <wp:inline xmlns:a="http://schemas.openxmlformats.org/drawingml/2006/main" xmlns:pic="http://schemas.openxmlformats.org/drawingml/2006/picture">
-            <wp:extent cx="4885714" cy="6840000"/>
-            <wp:docPr id="20" name="Picture 20"/>
+            <wp:extent cx="5040000" cy="7056000"/>
+            <wp:docPr id="21" name="Picture 21"/>
             <wp:cNvGraphicFramePr>
               <a:graphicFrameLocks noChangeAspect="1"/>
             </wp:cNvGraphicFramePr>
@@ -2687,7 +2745,7 @@
                     <pic:cNvPicPr/>
                   </pic:nvPicPr>
                   <pic:blipFill>
-                    <a:blip r:embed="rId27"/>
+                    <a:blip r:embed="rId28"/>
                     <a:stretch>
                       <a:fillRect/>
                     </a:stretch>
@@ -2695,7 +2753,7 @@
                   <pic:spPr>
                     <a:xfrm>
                       <a:off x="0" y="0"/>
-                      <a:ext cx="4885714" cy="6840000"/>
+                      <a:ext cx="5040000" cy="7056000"/>
                     </a:xfrm>
                     <a:prstGeom prst="rect"/>
                   </pic:spPr>
@@ -2777,8 +2835,8 @@
       <w:r>
         <w:drawing>
           <wp:inline xmlns:a="http://schemas.openxmlformats.org/drawingml/2006/main" xmlns:pic="http://schemas.openxmlformats.org/drawingml/2006/picture">
-            <wp:extent cx="5688000" cy="5309915"/>
-            <wp:docPr id="21" name="Picture 21"/>
+            <wp:extent cx="6263999" cy="6046601"/>
+            <wp:docPr id="22" name="Picture 22"/>
             <wp:cNvGraphicFramePr>
               <a:graphicFrameLocks noChangeAspect="1"/>
             </wp:cNvGraphicFramePr>
@@ -2790,7 +2848,7 @@
                     <pic:cNvPicPr/>
                   </pic:nvPicPr>
                   <pic:blipFill>
-                    <a:blip r:embed="rId28"/>
+                    <a:blip r:embed="rId29"/>
                     <a:stretch>
                       <a:fillRect/>
                     </a:stretch>
@@ -2798,7 +2856,7 @@
                   <pic:spPr>
                     <a:xfrm>
                       <a:off x="0" y="0"/>
-                      <a:ext cx="5688000" cy="5309915"/>
+                      <a:ext cx="6263999" cy="6046601"/>
                     </a:xfrm>
                     <a:prstGeom prst="rect"/>
                   </pic:spPr>
@@ -2832,7 +2890,7 @@
       </w:r>
     </w:p>
     <w:sectPr>
-      <w:pgSz w:w="11906" w:h="16838"/>
+      <w:pgSz w:w="12240" w:h="15840"/>
       <w:pgMar w:top="850" w:right="1020" w:bottom="850" w:left="1020" w:header="720" w:footer="720" w:gutter="0"/>
       <w:cols w:space="720"/>
       <w:docGrid w:linePitch="360"/>

</xml_diff>

<commit_message>
Counting ladybugs on one page (1-4) and add 8 new activities (19-26)
- A contar mariquitas now fits a single page with 4 ladybugs (1-4); 16 mm
  spots cannot fit 5+ ladybugs cleanly on one Letter page.
- New activities (16 mm stickers, Letter, with playful descriptions):
  19 Manos contadoras, 20 La abeja y la flor (trazo vertical),
  21 Mi cometa (trazo vertical), 22 Del carro a la casa (trazo horizontal),
  23 Collar de colores (patrones), 24 Tabla de conteo 1-5,
  25 Cupcakes 1-3, 26 Tren de colores 1-5.
- Lay out each activity with page-break-before to avoid blank pages.
- Book now 29 pages (26 activities). Fonts re-embedded; PDF rebuilt.

Co-authored-by: hectorrios-ui <hectorrios-ui@users.noreply.github.com>
</commit_message>
<xml_diff>
--- a/libro-stickers-digital/Libro_Actividades_Stickers_Mi_Dulce_Emma.docx
+++ b/libro-stickers-digital/Libro_Actividades_Stickers_Mi_Dulce_Emma.docx
@@ -1003,7 +1003,6 @@
     </w:p>
     <w:p>
       <w:pPr>
-        <w:keepNext/>
         <w:spacing w:before="120" w:after="120" w:line="288" w:lineRule="auto"/>
         <w:jc w:val="left"/>
       </w:pPr>
@@ -1059,13 +1058,9 @@
       </w:r>
     </w:p>
     <w:p>
-      <w:r>
-        <w:br w:type="page"/>
-      </w:r>
-    </w:p>
-    <w:p>
       <w:pPr>
         <w:keepNext/>
+        <w:pageBreakBefore/>
         <w:spacing w:before="0" w:after="40" w:line="283" w:lineRule="auto"/>
         <w:jc w:val="left"/>
         <w:pBdr>
@@ -1106,7 +1101,6 @@
     </w:p>
     <w:p>
       <w:pPr>
-        <w:keepNext/>
         <w:spacing w:before="120" w:after="120" w:line="288" w:lineRule="auto"/>
         <w:jc w:val="left"/>
       </w:pPr>
@@ -1162,13 +1156,9 @@
       </w:r>
     </w:p>
     <w:p>
-      <w:r>
-        <w:br w:type="page"/>
-      </w:r>
-    </w:p>
-    <w:p>
       <w:pPr>
         <w:keepNext/>
+        <w:pageBreakBefore/>
         <w:spacing w:before="0" w:after="40" w:line="283" w:lineRule="auto"/>
         <w:jc w:val="left"/>
         <w:pBdr>
@@ -1209,7 +1199,6 @@
     </w:p>
     <w:p>
       <w:pPr>
-        <w:keepNext/>
         <w:spacing w:before="120" w:after="120" w:line="288" w:lineRule="auto"/>
         <w:jc w:val="left"/>
       </w:pPr>
@@ -1265,13 +1254,9 @@
       </w:r>
     </w:p>
     <w:p>
-      <w:r>
-        <w:br w:type="page"/>
-      </w:r>
-    </w:p>
-    <w:p>
       <w:pPr>
         <w:keepNext/>
+        <w:pageBreakBefore/>
         <w:spacing w:before="0" w:after="40" w:line="283" w:lineRule="auto"/>
         <w:jc w:val="left"/>
         <w:pBdr>
@@ -1312,7 +1297,6 @@
     </w:p>
     <w:p>
       <w:pPr>
-        <w:keepNext/>
         <w:spacing w:before="120" w:after="120" w:line="288" w:lineRule="auto"/>
         <w:jc w:val="left"/>
       </w:pPr>
@@ -1368,13 +1352,9 @@
       </w:r>
     </w:p>
     <w:p>
-      <w:r>
-        <w:br w:type="page"/>
-      </w:r>
-    </w:p>
-    <w:p>
       <w:pPr>
         <w:keepNext/>
+        <w:pageBreakBefore/>
         <w:spacing w:before="0" w:after="40" w:line="283" w:lineRule="auto"/>
         <w:jc w:val="left"/>
         <w:pBdr>
@@ -1415,7 +1395,6 @@
     </w:p>
     <w:p>
       <w:pPr>
-        <w:keepNext/>
         <w:spacing w:before="120" w:after="120" w:line="288" w:lineRule="auto"/>
         <w:jc w:val="left"/>
       </w:pPr>
@@ -1471,13 +1450,9 @@
       </w:r>
     </w:p>
     <w:p>
-      <w:r>
-        <w:br w:type="page"/>
-      </w:r>
-    </w:p>
-    <w:p>
       <w:pPr>
         <w:keepNext/>
+        <w:pageBreakBefore/>
         <w:spacing w:before="0" w:after="40" w:line="283" w:lineRule="auto"/>
         <w:jc w:val="left"/>
         <w:pBdr>
@@ -1518,7 +1493,6 @@
     </w:p>
     <w:p>
       <w:pPr>
-        <w:keepNext/>
         <w:spacing w:before="120" w:after="120" w:line="288" w:lineRule="auto"/>
         <w:jc w:val="left"/>
       </w:pPr>
@@ -1574,13 +1548,9 @@
       </w:r>
     </w:p>
     <w:p>
-      <w:r>
-        <w:br w:type="page"/>
-      </w:r>
-    </w:p>
-    <w:p>
       <w:pPr>
         <w:keepNext/>
+        <w:pageBreakBefore/>
         <w:spacing w:before="0" w:after="40" w:line="283" w:lineRule="auto"/>
         <w:jc w:val="left"/>
         <w:pBdr>
@@ -1621,7 +1591,6 @@
     </w:p>
     <w:p>
       <w:pPr>
-        <w:keepNext/>
         <w:spacing w:before="120" w:after="120" w:line="288" w:lineRule="auto"/>
         <w:jc w:val="left"/>
       </w:pPr>
@@ -1677,13 +1646,9 @@
       </w:r>
     </w:p>
     <w:p>
-      <w:r>
-        <w:br w:type="page"/>
-      </w:r>
-    </w:p>
-    <w:p>
       <w:pPr>
         <w:keepNext/>
+        <w:pageBreakBefore/>
         <w:spacing w:before="0" w:after="40" w:line="283" w:lineRule="auto"/>
         <w:jc w:val="left"/>
         <w:pBdr>
@@ -1724,7 +1689,6 @@
     </w:p>
     <w:p>
       <w:pPr>
-        <w:keepNext/>
         <w:spacing w:before="120" w:after="120" w:line="288" w:lineRule="auto"/>
         <w:jc w:val="left"/>
       </w:pPr>
@@ -1780,13 +1744,9 @@
       </w:r>
     </w:p>
     <w:p>
-      <w:r>
-        <w:br w:type="page"/>
-      </w:r>
-    </w:p>
-    <w:p>
       <w:pPr>
         <w:keepNext/>
+        <w:pageBreakBefore/>
         <w:spacing w:before="0" w:after="40" w:line="283" w:lineRule="auto"/>
         <w:jc w:val="left"/>
         <w:pBdr>
@@ -1827,7 +1787,6 @@
     </w:p>
     <w:p>
       <w:pPr>
-        <w:keepNext/>
         <w:spacing w:before="120" w:after="120" w:line="288" w:lineRule="auto"/>
         <w:jc w:val="left"/>
       </w:pPr>
@@ -1883,13 +1842,9 @@
       </w:r>
     </w:p>
     <w:p>
-      <w:r>
-        <w:br w:type="page"/>
-      </w:r>
-    </w:p>
-    <w:p>
       <w:pPr>
         <w:keepNext/>
+        <w:pageBreakBefore/>
         <w:spacing w:before="0" w:after="40" w:line="283" w:lineRule="auto"/>
         <w:jc w:val="left"/>
         <w:pBdr>
@@ -1930,7 +1885,6 @@
     </w:p>
     <w:p>
       <w:pPr>
-        <w:keepNext/>
         <w:spacing w:before="120" w:after="120" w:line="288" w:lineRule="auto"/>
         <w:jc w:val="left"/>
       </w:pPr>
@@ -1986,13 +1940,9 @@
       </w:r>
     </w:p>
     <w:p>
-      <w:r>
-        <w:br w:type="page"/>
-      </w:r>
-    </w:p>
-    <w:p>
       <w:pPr>
         <w:keepNext/>
+        <w:pageBreakBefore/>
         <w:spacing w:before="0" w:after="40" w:line="283" w:lineRule="auto"/>
         <w:jc w:val="left"/>
         <w:pBdr>
@@ -2033,7 +1983,6 @@
     </w:p>
     <w:p>
       <w:pPr>
-        <w:keepNext/>
         <w:spacing w:before="120" w:after="120" w:line="288" w:lineRule="auto"/>
         <w:jc w:val="left"/>
       </w:pPr>
@@ -2089,13 +2038,9 @@
       </w:r>
     </w:p>
     <w:p>
-      <w:r>
-        <w:br w:type="page"/>
-      </w:r>
-    </w:p>
-    <w:p>
       <w:pPr>
         <w:keepNext/>
+        <w:pageBreakBefore/>
         <w:spacing w:before="0" w:after="40" w:line="283" w:lineRule="auto"/>
         <w:jc w:val="left"/>
         <w:pBdr>
@@ -2136,7 +2081,6 @@
     </w:p>
     <w:p>
       <w:pPr>
-        <w:keepNext/>
         <w:spacing w:before="120" w:after="120" w:line="288" w:lineRule="auto"/>
         <w:jc w:val="left"/>
       </w:pPr>
@@ -2192,13 +2136,9 @@
       </w:r>
     </w:p>
     <w:p>
-      <w:r>
-        <w:br w:type="page"/>
-      </w:r>
-    </w:p>
-    <w:p>
       <w:pPr>
         <w:keepNext/>
+        <w:pageBreakBefore/>
         <w:spacing w:before="0" w:after="40" w:line="283" w:lineRule="auto"/>
         <w:jc w:val="left"/>
         <w:pBdr>
@@ -2239,7 +2179,6 @@
     </w:p>
     <w:p>
       <w:pPr>
-        <w:keepNext/>
         <w:spacing w:before="120" w:after="120" w:line="288" w:lineRule="auto"/>
         <w:jc w:val="left"/>
       </w:pPr>
@@ -2295,13 +2234,9 @@
       </w:r>
     </w:p>
     <w:p>
-      <w:r>
-        <w:br w:type="page"/>
-      </w:r>
-    </w:p>
-    <w:p>
       <w:pPr>
         <w:keepNext/>
+        <w:pageBreakBefore/>
         <w:spacing w:before="0" w:after="40" w:line="283" w:lineRule="auto"/>
         <w:jc w:val="left"/>
         <w:pBdr>
@@ -2342,7 +2277,6 @@
     </w:p>
     <w:p>
       <w:pPr>
-        <w:keepNext/>
         <w:spacing w:before="120" w:after="120" w:line="288" w:lineRule="auto"/>
         <w:jc w:val="left"/>
       </w:pPr>
@@ -2398,13 +2332,9 @@
       </w:r>
     </w:p>
     <w:p>
-      <w:r>
-        <w:br w:type="page"/>
-      </w:r>
-    </w:p>
-    <w:p>
       <w:pPr>
         <w:keepNext/>
+        <w:pageBreakBefore/>
         <w:spacing w:before="0" w:after="40" w:line="283" w:lineRule="auto"/>
         <w:jc w:val="left"/>
         <w:pBdr>
@@ -2445,7 +2375,6 @@
     </w:p>
     <w:p>
       <w:pPr>
-        <w:keepNext/>
         <w:spacing w:before="120" w:after="120" w:line="288" w:lineRule="auto"/>
         <w:jc w:val="left"/>
       </w:pPr>
@@ -2501,13 +2430,9 @@
       </w:r>
     </w:p>
     <w:p>
-      <w:r>
-        <w:br w:type="page"/>
-      </w:r>
-    </w:p>
-    <w:p>
       <w:pPr>
         <w:keepNext/>
+        <w:pageBreakBefore/>
         <w:spacing w:before="0" w:after="40" w:line="283" w:lineRule="auto"/>
         <w:jc w:val="left"/>
         <w:pBdr>
@@ -2548,7 +2473,6 @@
     </w:p>
     <w:p>
       <w:pPr>
-        <w:keepNext/>
         <w:spacing w:before="120" w:after="120" w:line="288" w:lineRule="auto"/>
         <w:jc w:val="left"/>
       </w:pPr>
@@ -2560,7 +2484,7 @@
           <w:color w:val="3A3A4A"/>
           <w:sz w:val="28"/>
         </w:rPr>
-        <w:t>Aquí tienes seis mariquitas y cada una lleva su número. Pega tantas manchas negras como indique cada una: 1 mancha a la primera, 2 a la segunda, 3 a la tercera… y así hasta llegar a 6. Cuenta en voz alta mientras las colocas para practicar los números y la correspondencia.</w:t>
+        <w:t>Cada mariquita lleva su número. Pega tantas manchas negras como indique cada una: 1 mancha a la primera, 2 a la segunda, 3 a la tercera y 4 a la cuarta. Cuenta en voz alta mientras las colocas para practicar los números y la correspondencia uno a uno.</w:t>
       </w:r>
     </w:p>
     <w:p>
@@ -2580,7 +2504,7 @@
               <a:graphicData uri="http://schemas.openxmlformats.org/drawingml/2006/picture">
                 <pic:pic>
                   <pic:nvPicPr>
-                    <pic:cNvPr id="0" name="21_conteo_a.png"/>
+                    <pic:cNvPr id="0" name="21_conteo.png"/>
                     <pic:cNvPicPr/>
                   </pic:nvPicPr>
                   <pic:blipFill>
@@ -2607,68 +2531,6 @@
       <w:pPr>
         <w:keepNext/>
         <w:pageBreakBefore/>
-        <w:spacing w:before="0" w:after="120" w:line="288" w:lineRule="auto"/>
-        <w:jc w:val="left"/>
-      </w:pPr>
-      <w:r>
-        <w:rPr>
-          <w:rFonts w:ascii="Fredoka" w:hAnsi="Fredoka" w:cs="Fredoka"/>
-          <w:b/>
-          <w:i w:val="0"/>
-          <w:color w:val="FF5168"/>
-          <w:sz w:val="32"/>
-        </w:rPr>
-        <w:t>A contar mariquitas (continuación)</w:t>
-      </w:r>
-    </w:p>
-    <w:p>
-      <w:pPr>
-        <w:spacing w:before="80" w:after="80" w:line="240" w:lineRule="auto"/>
-        <w:jc w:val="center"/>
-      </w:pPr>
-      <w:r>
-        <w:drawing>
-          <wp:inline xmlns:a="http://schemas.openxmlformats.org/drawingml/2006/main" xmlns:pic="http://schemas.openxmlformats.org/drawingml/2006/picture">
-            <wp:extent cx="6192000" cy="7055238"/>
-            <wp:docPr id="20" name="Picture 20"/>
-            <wp:cNvGraphicFramePr>
-              <a:graphicFrameLocks noChangeAspect="1"/>
-            </wp:cNvGraphicFramePr>
-            <a:graphic>
-              <a:graphicData uri="http://schemas.openxmlformats.org/drawingml/2006/picture">
-                <pic:pic>
-                  <pic:nvPicPr>
-                    <pic:cNvPr id="0" name="21_conteo_b.png"/>
-                    <pic:cNvPicPr/>
-                  </pic:nvPicPr>
-                  <pic:blipFill>
-                    <a:blip r:embed="rId27"/>
-                    <a:stretch>
-                      <a:fillRect/>
-                    </a:stretch>
-                  </pic:blipFill>
-                  <pic:spPr>
-                    <a:xfrm>
-                      <a:off x="0" y="0"/>
-                      <a:ext cx="6192000" cy="7055238"/>
-                    </a:xfrm>
-                    <a:prstGeom prst="rect"/>
-                  </pic:spPr>
-                </pic:pic>
-              </a:graphicData>
-            </a:graphic>
-          </wp:inline>
-        </w:drawing>
-      </w:r>
-    </w:p>
-    <w:p>
-      <w:r>
-        <w:br w:type="page"/>
-      </w:r>
-    </w:p>
-    <w:p>
-      <w:pPr>
-        <w:keepNext/>
         <w:spacing w:before="0" w:after="40" w:line="283" w:lineRule="auto"/>
         <w:jc w:val="left"/>
         <w:pBdr>
@@ -2709,7 +2571,6 @@
     </w:p>
     <w:p>
       <w:pPr>
-        <w:keepNext/>
         <w:spacing w:before="120" w:after="120" w:line="288" w:lineRule="auto"/>
         <w:jc w:val="left"/>
       </w:pPr>
@@ -2733,7 +2594,7 @@
         <w:drawing>
           <wp:inline xmlns:a="http://schemas.openxmlformats.org/drawingml/2006/main" xmlns:pic="http://schemas.openxmlformats.org/drawingml/2006/picture">
             <wp:extent cx="5040000" cy="7056000"/>
-            <wp:docPr id="21" name="Picture 21"/>
+            <wp:docPr id="20" name="Picture 20"/>
             <wp:cNvGraphicFramePr>
               <a:graphicFrameLocks noChangeAspect="1"/>
             </wp:cNvGraphicFramePr>
@@ -2745,7 +2606,7 @@
                     <pic:cNvPicPr/>
                   </pic:nvPicPr>
                   <pic:blipFill>
-                    <a:blip r:embed="rId28"/>
+                    <a:blip r:embed="rId27"/>
                     <a:stretch>
                       <a:fillRect/>
                     </a:stretch>
@@ -2765,13 +2626,9 @@
       </w:r>
     </w:p>
     <w:p>
-      <w:r>
-        <w:br w:type="page"/>
-      </w:r>
-    </w:p>
-    <w:p>
       <w:pPr>
         <w:keepNext/>
+        <w:pageBreakBefore/>
         <w:spacing w:before="0" w:after="40" w:line="283" w:lineRule="auto"/>
         <w:jc w:val="left"/>
         <w:pBdr>
@@ -2812,7 +2669,6 @@
     </w:p>
     <w:p>
       <w:pPr>
-        <w:keepNext/>
         <w:spacing w:before="120" w:after="120" w:line="288" w:lineRule="auto"/>
         <w:jc w:val="left"/>
       </w:pPr>
@@ -2836,7 +2692,7 @@
         <w:drawing>
           <wp:inline xmlns:a="http://schemas.openxmlformats.org/drawingml/2006/main" xmlns:pic="http://schemas.openxmlformats.org/drawingml/2006/picture">
             <wp:extent cx="6263999" cy="6046601"/>
-            <wp:docPr id="22" name="Picture 22"/>
+            <wp:docPr id="21" name="Picture 21"/>
             <wp:cNvGraphicFramePr>
               <a:graphicFrameLocks noChangeAspect="1"/>
             </wp:cNvGraphicFramePr>
@@ -2848,6 +2704,104 @@
                     <pic:cNvPicPr/>
                   </pic:nvPicPr>
                   <pic:blipFill>
+                    <a:blip r:embed="rId28"/>
+                    <a:stretch>
+                      <a:fillRect/>
+                    </a:stretch>
+                  </pic:blipFill>
+                  <pic:spPr>
+                    <a:xfrm>
+                      <a:off x="0" y="0"/>
+                      <a:ext cx="6263999" cy="6046601"/>
+                    </a:xfrm>
+                    <a:prstGeom prst="rect"/>
+                  </pic:spPr>
+                </pic:pic>
+              </a:graphicData>
+            </a:graphic>
+          </wp:inline>
+        </w:drawing>
+      </w:r>
+    </w:p>
+    <w:p>
+      <w:pPr>
+        <w:keepNext/>
+        <w:pageBreakBefore/>
+        <w:spacing w:before="0" w:after="40" w:line="283" w:lineRule="auto"/>
+        <w:jc w:val="left"/>
+        <w:pBdr>
+          <w:bottom w:val="single" w:sz="16" w:space="6" w:color="2E8BFF"/>
+        </w:pBdr>
+      </w:pPr>
+      <w:r>
+        <w:rPr>
+          <w:rFonts w:ascii="Fredoka" w:hAnsi="Fredoka" w:cs="Fredoka"/>
+          <w:b/>
+          <w:i w:val="0"/>
+          <w:color w:val="FFFFFF"/>
+          <w:sz w:val="28"/>
+          <w:shd w:val="clear" w:color="auto" w:fill="2E8BFF"/>
+        </w:rPr>
+        <w:t xml:space="preserve">  19  </w:t>
+      </w:r>
+      <w:r>
+        <w:rPr>
+          <w:rFonts w:ascii="Fredoka" w:hAnsi="Fredoka" w:cs="Fredoka"/>
+          <w:b w:val="0"/>
+          <w:i w:val="0"/>
+          <w:color w:val="3A3A4A"/>
+          <w:sz w:val="28"/>
+        </w:rPr>
+        <w:t xml:space="preserve">   </w:t>
+      </w:r>
+      <w:r>
+        <w:rPr>
+          <w:rFonts w:ascii="Fredoka" w:hAnsi="Fredoka" w:cs="Fredoka"/>
+          <w:b/>
+          <w:i w:val="0"/>
+          <w:color w:val="2E8BFF"/>
+          <w:sz w:val="48"/>
+        </w:rPr>
+        <w:t>Manos contadoras</w:t>
+      </w:r>
+    </w:p>
+    <w:p>
+      <w:pPr>
+        <w:spacing w:before="120" w:after="120" w:line="288" w:lineRule="auto"/>
+        <w:jc w:val="left"/>
+      </w:pPr>
+      <w:r>
+        <w:rPr>
+          <w:rFonts w:ascii="Nunito" w:hAnsi="Nunito" w:cs="Nunito"/>
+          <w:b w:val="0"/>
+          <w:i w:val="0"/>
+          <w:color w:val="3A3A4A"/>
+          <w:sz w:val="28"/>
+        </w:rPr>
+        <w:t>¡A contar con los deditos! Pega un sticker en la yema de cada dedo y cuéntalos uno a uno: 1, 2, 3… hasta llegar a 10. Ideal para practicar el conteo uno a uno y la coordinación de las manitos.</w:t>
+      </w:r>
+    </w:p>
+    <w:p>
+      <w:pPr>
+        <w:spacing w:before="80" w:after="80" w:line="240" w:lineRule="auto"/>
+        <w:jc w:val="center"/>
+      </w:pPr>
+      <w:r>
+        <w:drawing>
+          <wp:inline xmlns:a="http://schemas.openxmlformats.org/drawingml/2006/main" xmlns:pic="http://schemas.openxmlformats.org/drawingml/2006/picture">
+            <wp:extent cx="6408000" cy="4606221"/>
+            <wp:docPr id="22" name="Picture 22"/>
+            <wp:cNvGraphicFramePr>
+              <a:graphicFrameLocks noChangeAspect="1"/>
+            </wp:cNvGraphicFramePr>
+            <a:graphic>
+              <a:graphicData uri="http://schemas.openxmlformats.org/drawingml/2006/picture">
+                <pic:pic>
+                  <pic:nvPicPr>
+                    <pic:cNvPr id="0" name="22_manos.png"/>
+                    <pic:cNvPicPr/>
+                  </pic:nvPicPr>
+                  <pic:blipFill>
                     <a:blip r:embed="rId29"/>
                     <a:stretch>
                       <a:fillRect/>
@@ -2856,7 +2810,693 @@
                   <pic:spPr>
                     <a:xfrm>
                       <a:off x="0" y="0"/>
-                      <a:ext cx="6263999" cy="6046601"/>
+                      <a:ext cx="6408000" cy="4606221"/>
+                    </a:xfrm>
+                    <a:prstGeom prst="rect"/>
+                  </pic:spPr>
+                </pic:pic>
+              </a:graphicData>
+            </a:graphic>
+          </wp:inline>
+        </w:drawing>
+      </w:r>
+    </w:p>
+    <w:p>
+      <w:pPr>
+        <w:keepNext/>
+        <w:pageBreakBefore/>
+        <w:spacing w:before="0" w:after="40" w:line="283" w:lineRule="auto"/>
+        <w:jc w:val="left"/>
+        <w:pBdr>
+          <w:bottom w:val="single" w:sz="16" w:space="6" w:color="F0B021"/>
+        </w:pBdr>
+      </w:pPr>
+      <w:r>
+        <w:rPr>
+          <w:rFonts w:ascii="Fredoka" w:hAnsi="Fredoka" w:cs="Fredoka"/>
+          <w:b/>
+          <w:i w:val="0"/>
+          <w:color w:val="FFFFFF"/>
+          <w:sz w:val="28"/>
+          <w:shd w:val="clear" w:color="auto" w:fill="F0B021"/>
+        </w:rPr>
+        <w:t xml:space="preserve">  20  </w:t>
+      </w:r>
+      <w:r>
+        <w:rPr>
+          <w:rFonts w:ascii="Fredoka" w:hAnsi="Fredoka" w:cs="Fredoka"/>
+          <w:b w:val="0"/>
+          <w:i w:val="0"/>
+          <w:color w:val="3A3A4A"/>
+          <w:sz w:val="28"/>
+        </w:rPr>
+        <w:t xml:space="preserve">   </w:t>
+      </w:r>
+      <w:r>
+        <w:rPr>
+          <w:rFonts w:ascii="Fredoka" w:hAnsi="Fredoka" w:cs="Fredoka"/>
+          <w:b/>
+          <w:i w:val="0"/>
+          <w:color w:val="F0B021"/>
+          <w:sz w:val="48"/>
+        </w:rPr>
+        <w:t>La abeja y la flor</w:t>
+      </w:r>
+    </w:p>
+    <w:p>
+      <w:pPr>
+        <w:spacing w:before="120" w:after="120" w:line="288" w:lineRule="auto"/>
+        <w:jc w:val="left"/>
+      </w:pPr>
+      <w:r>
+        <w:rPr>
+          <w:rFonts w:ascii="Nunito" w:hAnsi="Nunito" w:cs="Nunito"/>
+          <w:b w:val="0"/>
+          <w:i w:val="0"/>
+          <w:color w:val="3A3A4A"/>
+          <w:sz w:val="28"/>
+        </w:rPr>
+        <w:t>Ayuda a la abejita a bajar hasta la flor. Pega un sticker en cada círculo siguiendo la línea de arriba hacia abajo, sin salirte. Así practicamos el trazo vertical, tan importante para empezar a escribir.</w:t>
+      </w:r>
+    </w:p>
+    <w:p>
+      <w:pPr>
+        <w:spacing w:before="80" w:after="80" w:line="240" w:lineRule="auto"/>
+        <w:jc w:val="center"/>
+      </w:pPr>
+      <w:r>
+        <w:drawing>
+          <wp:inline xmlns:a="http://schemas.openxmlformats.org/drawingml/2006/main" xmlns:pic="http://schemas.openxmlformats.org/drawingml/2006/picture">
+            <wp:extent cx="3168000" cy="7200678"/>
+            <wp:docPr id="23" name="Picture 23"/>
+            <wp:cNvGraphicFramePr>
+              <a:graphicFrameLocks noChangeAspect="1"/>
+            </wp:cNvGraphicFramePr>
+            <a:graphic>
+              <a:graphicData uri="http://schemas.openxmlformats.org/drawingml/2006/picture">
+                <pic:pic>
+                  <pic:nvPicPr>
+                    <pic:cNvPr id="0" name="23_abeja.png"/>
+                    <pic:cNvPicPr/>
+                  </pic:nvPicPr>
+                  <pic:blipFill>
+                    <a:blip r:embed="rId30"/>
+                    <a:stretch>
+                      <a:fillRect/>
+                    </a:stretch>
+                  </pic:blipFill>
+                  <pic:spPr>
+                    <a:xfrm>
+                      <a:off x="0" y="0"/>
+                      <a:ext cx="3168000" cy="7200678"/>
+                    </a:xfrm>
+                    <a:prstGeom prst="rect"/>
+                  </pic:spPr>
+                </pic:pic>
+              </a:graphicData>
+            </a:graphic>
+          </wp:inline>
+        </w:drawing>
+      </w:r>
+    </w:p>
+    <w:p>
+      <w:pPr>
+        <w:keepNext/>
+        <w:pageBreakBefore/>
+        <w:spacing w:before="0" w:after="40" w:line="283" w:lineRule="auto"/>
+        <w:jc w:val="left"/>
+        <w:pBdr>
+          <w:bottom w:val="single" w:sz="16" w:space="6" w:color="FF5168"/>
+        </w:pBdr>
+      </w:pPr>
+      <w:r>
+        <w:rPr>
+          <w:rFonts w:ascii="Fredoka" w:hAnsi="Fredoka" w:cs="Fredoka"/>
+          <w:b/>
+          <w:i w:val="0"/>
+          <w:color w:val="FFFFFF"/>
+          <w:sz w:val="28"/>
+          <w:shd w:val="clear" w:color="auto" w:fill="FF5168"/>
+        </w:rPr>
+        <w:t xml:space="preserve">  21  </w:t>
+      </w:r>
+      <w:r>
+        <w:rPr>
+          <w:rFonts w:ascii="Fredoka" w:hAnsi="Fredoka" w:cs="Fredoka"/>
+          <w:b w:val="0"/>
+          <w:i w:val="0"/>
+          <w:color w:val="3A3A4A"/>
+          <w:sz w:val="28"/>
+        </w:rPr>
+        <w:t xml:space="preserve">   </w:t>
+      </w:r>
+      <w:r>
+        <w:rPr>
+          <w:rFonts w:ascii="Fredoka" w:hAnsi="Fredoka" w:cs="Fredoka"/>
+          <w:b/>
+          <w:i w:val="0"/>
+          <w:color w:val="FF5168"/>
+          <w:sz w:val="48"/>
+        </w:rPr>
+        <w:t>Mi cometa</w:t>
+      </w:r>
+    </w:p>
+    <w:p>
+      <w:pPr>
+        <w:spacing w:before="120" w:after="120" w:line="288" w:lineRule="auto"/>
+        <w:jc w:val="left"/>
+      </w:pPr>
+      <w:r>
+        <w:rPr>
+          <w:rFonts w:ascii="Nunito" w:hAnsi="Nunito" w:cs="Nunito"/>
+          <w:b w:val="0"/>
+          <w:i w:val="0"/>
+          <w:color w:val="3A3A4A"/>
+          <w:sz w:val="28"/>
+        </w:rPr>
+        <w:t>¡A volar la cometa! Decora su cola pegando un moño (sticker) en cada círculo, de arriba hacia abajo. Trabajamos el trazo vertical y la atención mientras la cola se llena de color.</w:t>
+      </w:r>
+    </w:p>
+    <w:p>
+      <w:pPr>
+        <w:spacing w:before="80" w:after="80" w:line="240" w:lineRule="auto"/>
+        <w:jc w:val="center"/>
+      </w:pPr>
+      <w:r>
+        <w:drawing>
+          <wp:inline xmlns:a="http://schemas.openxmlformats.org/drawingml/2006/main" xmlns:pic="http://schemas.openxmlformats.org/drawingml/2006/picture">
+            <wp:extent cx="3600000" cy="7200000"/>
+            <wp:docPr id="24" name="Picture 24"/>
+            <wp:cNvGraphicFramePr>
+              <a:graphicFrameLocks noChangeAspect="1"/>
+            </wp:cNvGraphicFramePr>
+            <a:graphic>
+              <a:graphicData uri="http://schemas.openxmlformats.org/drawingml/2006/picture">
+                <pic:pic>
+                  <pic:nvPicPr>
+                    <pic:cNvPr id="0" name="24_cometa.png"/>
+                    <pic:cNvPicPr/>
+                  </pic:nvPicPr>
+                  <pic:blipFill>
+                    <a:blip r:embed="rId31"/>
+                    <a:stretch>
+                      <a:fillRect/>
+                    </a:stretch>
+                  </pic:blipFill>
+                  <pic:spPr>
+                    <a:xfrm>
+                      <a:off x="0" y="0"/>
+                      <a:ext cx="3600000" cy="7200000"/>
+                    </a:xfrm>
+                    <a:prstGeom prst="rect"/>
+                  </pic:spPr>
+                </pic:pic>
+              </a:graphicData>
+            </a:graphic>
+          </wp:inline>
+        </w:drawing>
+      </w:r>
+    </w:p>
+    <w:p>
+      <w:pPr>
+        <w:keepNext/>
+        <w:pageBreakBefore/>
+        <w:spacing w:before="0" w:after="40" w:line="283" w:lineRule="auto"/>
+        <w:jc w:val="left"/>
+        <w:pBdr>
+          <w:bottom w:val="single" w:sz="16" w:space="6" w:color="22A455"/>
+        </w:pBdr>
+      </w:pPr>
+      <w:r>
+        <w:rPr>
+          <w:rFonts w:ascii="Fredoka" w:hAnsi="Fredoka" w:cs="Fredoka"/>
+          <w:b/>
+          <w:i w:val="0"/>
+          <w:color w:val="FFFFFF"/>
+          <w:sz w:val="28"/>
+          <w:shd w:val="clear" w:color="auto" w:fill="22A455"/>
+        </w:rPr>
+        <w:t xml:space="preserve">  22  </w:t>
+      </w:r>
+      <w:r>
+        <w:rPr>
+          <w:rFonts w:ascii="Fredoka" w:hAnsi="Fredoka" w:cs="Fredoka"/>
+          <w:b w:val="0"/>
+          <w:i w:val="0"/>
+          <w:color w:val="3A3A4A"/>
+          <w:sz w:val="28"/>
+        </w:rPr>
+        <w:t xml:space="preserve">   </w:t>
+      </w:r>
+      <w:r>
+        <w:rPr>
+          <w:rFonts w:ascii="Fredoka" w:hAnsi="Fredoka" w:cs="Fredoka"/>
+          <w:b/>
+          <w:i w:val="0"/>
+          <w:color w:val="22A455"/>
+          <w:sz w:val="48"/>
+        </w:rPr>
+        <w:t>Del carro a la casa</w:t>
+      </w:r>
+    </w:p>
+    <w:p>
+      <w:pPr>
+        <w:spacing w:before="120" w:after="120" w:line="288" w:lineRule="auto"/>
+        <w:jc w:val="left"/>
+      </w:pPr>
+      <w:r>
+        <w:rPr>
+          <w:rFonts w:ascii="Nunito" w:hAnsi="Nunito" w:cs="Nunito"/>
+          <w:b w:val="0"/>
+          <w:i w:val="0"/>
+          <w:color w:val="3A3A4A"/>
+          <w:sz w:val="28"/>
+        </w:rPr>
+        <w:t>El carrito quiere llegar a su casa. Pega un sticker en cada círculo del camino, de izquierda a derecha, para completar la ruta. Practicamos el trazo horizontal y la direccionalidad.</w:t>
+      </w:r>
+    </w:p>
+    <w:p>
+      <w:pPr>
+        <w:spacing w:before="80" w:after="80" w:line="240" w:lineRule="auto"/>
+        <w:jc w:val="center"/>
+      </w:pPr>
+      <w:r>
+        <w:drawing>
+          <wp:inline xmlns:a="http://schemas.openxmlformats.org/drawingml/2006/main" xmlns:pic="http://schemas.openxmlformats.org/drawingml/2006/picture">
+            <wp:extent cx="6336000" cy="2735661"/>
+            <wp:docPr id="25" name="Picture 25"/>
+            <wp:cNvGraphicFramePr>
+              <a:graphicFrameLocks noChangeAspect="1"/>
+            </wp:cNvGraphicFramePr>
+            <a:graphic>
+              <a:graphicData uri="http://schemas.openxmlformats.org/drawingml/2006/picture">
+                <pic:pic>
+                  <pic:nvPicPr>
+                    <pic:cNvPr id="0" name="25_camino.png"/>
+                    <pic:cNvPicPr/>
+                  </pic:nvPicPr>
+                  <pic:blipFill>
+                    <a:blip r:embed="rId32"/>
+                    <a:stretch>
+                      <a:fillRect/>
+                    </a:stretch>
+                  </pic:blipFill>
+                  <pic:spPr>
+                    <a:xfrm>
+                      <a:off x="0" y="0"/>
+                      <a:ext cx="6336000" cy="2735661"/>
+                    </a:xfrm>
+                    <a:prstGeom prst="rect"/>
+                  </pic:spPr>
+                </pic:pic>
+              </a:graphicData>
+            </a:graphic>
+          </wp:inline>
+        </w:drawing>
+      </w:r>
+    </w:p>
+    <w:p>
+      <w:pPr>
+        <w:keepNext/>
+        <w:pageBreakBefore/>
+        <w:spacing w:before="0" w:after="40" w:line="283" w:lineRule="auto"/>
+        <w:jc w:val="left"/>
+        <w:pBdr>
+          <w:bottom w:val="single" w:sz="16" w:space="6" w:color="7E4FC0"/>
+        </w:pBdr>
+      </w:pPr>
+      <w:r>
+        <w:rPr>
+          <w:rFonts w:ascii="Fredoka" w:hAnsi="Fredoka" w:cs="Fredoka"/>
+          <w:b/>
+          <w:i w:val="0"/>
+          <w:color w:val="FFFFFF"/>
+          <w:sz w:val="28"/>
+          <w:shd w:val="clear" w:color="auto" w:fill="7E4FC0"/>
+        </w:rPr>
+        <w:t xml:space="preserve">  23  </w:t>
+      </w:r>
+      <w:r>
+        <w:rPr>
+          <w:rFonts w:ascii="Fredoka" w:hAnsi="Fredoka" w:cs="Fredoka"/>
+          <w:b w:val="0"/>
+          <w:i w:val="0"/>
+          <w:color w:val="3A3A4A"/>
+          <w:sz w:val="28"/>
+        </w:rPr>
+        <w:t xml:space="preserve">   </w:t>
+      </w:r>
+      <w:r>
+        <w:rPr>
+          <w:rFonts w:ascii="Fredoka" w:hAnsi="Fredoka" w:cs="Fredoka"/>
+          <w:b/>
+          <w:i w:val="0"/>
+          <w:color w:val="7E4FC0"/>
+          <w:sz w:val="48"/>
+        </w:rPr>
+        <w:t>Collar de colores</w:t>
+      </w:r>
+    </w:p>
+    <w:p>
+      <w:pPr>
+        <w:spacing w:before="120" w:after="120" w:line="288" w:lineRule="auto"/>
+        <w:jc w:val="left"/>
+      </w:pPr>
+      <w:r>
+        <w:rPr>
+          <w:rFonts w:ascii="Nunito" w:hAnsi="Nunito" w:cs="Nunito"/>
+          <w:b w:val="0"/>
+          <w:i w:val="0"/>
+          <w:color w:val="3A3A4A"/>
+          <w:sz w:val="28"/>
+        </w:rPr>
+        <w:t>¡Arma un collar precioso! Observa el patrón de colores que ya empezó (rojo, azul, amarillo…) y continúalo pegando los stickers en el mismo orden. Trabajamos los patrones y la secuencia lógica.</w:t>
+      </w:r>
+    </w:p>
+    <w:p>
+      <w:pPr>
+        <w:spacing w:before="80" w:after="80" w:line="240" w:lineRule="auto"/>
+        <w:jc w:val="center"/>
+      </w:pPr>
+      <w:r>
+        <w:drawing>
+          <wp:inline xmlns:a="http://schemas.openxmlformats.org/drawingml/2006/main" xmlns:pic="http://schemas.openxmlformats.org/drawingml/2006/picture">
+            <wp:extent cx="6192000" cy="2735407"/>
+            <wp:docPr id="26" name="Picture 26"/>
+            <wp:cNvGraphicFramePr>
+              <a:graphicFrameLocks noChangeAspect="1"/>
+            </wp:cNvGraphicFramePr>
+            <a:graphic>
+              <a:graphicData uri="http://schemas.openxmlformats.org/drawingml/2006/picture">
+                <pic:pic>
+                  <pic:nvPicPr>
+                    <pic:cNvPr id="0" name="26_collar.png"/>
+                    <pic:cNvPicPr/>
+                  </pic:nvPicPr>
+                  <pic:blipFill>
+                    <a:blip r:embed="rId33"/>
+                    <a:stretch>
+                      <a:fillRect/>
+                    </a:stretch>
+                  </pic:blipFill>
+                  <pic:spPr>
+                    <a:xfrm>
+                      <a:off x="0" y="0"/>
+                      <a:ext cx="6192000" cy="2735407"/>
+                    </a:xfrm>
+                    <a:prstGeom prst="rect"/>
+                  </pic:spPr>
+                </pic:pic>
+              </a:graphicData>
+            </a:graphic>
+          </wp:inline>
+        </w:drawing>
+      </w:r>
+    </w:p>
+    <w:p>
+      <w:pPr>
+        <w:keepNext/>
+        <w:pageBreakBefore/>
+        <w:spacing w:before="0" w:after="40" w:line="283" w:lineRule="auto"/>
+        <w:jc w:val="left"/>
+        <w:pBdr>
+          <w:bottom w:val="single" w:sz="16" w:space="6" w:color="2E8BFF"/>
+        </w:pBdr>
+      </w:pPr>
+      <w:r>
+        <w:rPr>
+          <w:rFonts w:ascii="Fredoka" w:hAnsi="Fredoka" w:cs="Fredoka"/>
+          <w:b/>
+          <w:i w:val="0"/>
+          <w:color w:val="FFFFFF"/>
+          <w:sz w:val="28"/>
+          <w:shd w:val="clear" w:color="auto" w:fill="2E8BFF"/>
+        </w:rPr>
+        <w:t xml:space="preserve">  24  </w:t>
+      </w:r>
+      <w:r>
+        <w:rPr>
+          <w:rFonts w:ascii="Fredoka" w:hAnsi="Fredoka" w:cs="Fredoka"/>
+          <w:b w:val="0"/>
+          <w:i w:val="0"/>
+          <w:color w:val="3A3A4A"/>
+          <w:sz w:val="28"/>
+        </w:rPr>
+        <w:t xml:space="preserve">   </w:t>
+      </w:r>
+      <w:r>
+        <w:rPr>
+          <w:rFonts w:ascii="Fredoka" w:hAnsi="Fredoka" w:cs="Fredoka"/>
+          <w:b/>
+          <w:i w:val="0"/>
+          <w:color w:val="2E8BFF"/>
+          <w:sz w:val="48"/>
+        </w:rPr>
+        <w:t>Tabla de conteo</w:t>
+      </w:r>
+    </w:p>
+    <w:p>
+      <w:pPr>
+        <w:spacing w:before="120" w:after="120" w:line="288" w:lineRule="auto"/>
+        <w:jc w:val="left"/>
+      </w:pPr>
+      <w:r>
+        <w:rPr>
+          <w:rFonts w:ascii="Nunito" w:hAnsi="Nunito" w:cs="Nunito"/>
+          <w:b w:val="0"/>
+          <w:i w:val="0"/>
+          <w:color w:val="3A3A4A"/>
+          <w:sz w:val="28"/>
+        </w:rPr>
+        <w:t>Mira el número de cada columna y pega esa cantidad de stickers debajo: 1 en la columna del 1, 2 en la del 2… hasta el 5. Cuenta en voz alta para reforzar el conteo uno a uno y la noción de cantidad.</w:t>
+      </w:r>
+    </w:p>
+    <w:p>
+      <w:pPr>
+        <w:spacing w:before="80" w:after="80" w:line="240" w:lineRule="auto"/>
+        <w:jc w:val="center"/>
+      </w:pPr>
+      <w:r>
+        <w:drawing>
+          <wp:inline xmlns:a="http://schemas.openxmlformats.org/drawingml/2006/main" xmlns:pic="http://schemas.openxmlformats.org/drawingml/2006/picture">
+            <wp:extent cx="6336000" cy="5038984"/>
+            <wp:docPr id="27" name="Picture 27"/>
+            <wp:cNvGraphicFramePr>
+              <a:graphicFrameLocks noChangeAspect="1"/>
+            </wp:cNvGraphicFramePr>
+            <a:graphic>
+              <a:graphicData uri="http://schemas.openxmlformats.org/drawingml/2006/picture">
+                <pic:pic>
+                  <pic:nvPicPr>
+                    <pic:cNvPr id="0" name="27_tabla.png"/>
+                    <pic:cNvPicPr/>
+                  </pic:nvPicPr>
+                  <pic:blipFill>
+                    <a:blip r:embed="rId34"/>
+                    <a:stretch>
+                      <a:fillRect/>
+                    </a:stretch>
+                  </pic:blipFill>
+                  <pic:spPr>
+                    <a:xfrm>
+                      <a:off x="0" y="0"/>
+                      <a:ext cx="6336000" cy="5038984"/>
+                    </a:xfrm>
+                    <a:prstGeom prst="rect"/>
+                  </pic:spPr>
+                </pic:pic>
+              </a:graphicData>
+            </a:graphic>
+          </wp:inline>
+        </w:drawing>
+      </w:r>
+    </w:p>
+    <w:p>
+      <w:pPr>
+        <w:keepNext/>
+        <w:pageBreakBefore/>
+        <w:spacing w:before="0" w:after="40" w:line="283" w:lineRule="auto"/>
+        <w:jc w:val="left"/>
+        <w:pBdr>
+          <w:bottom w:val="single" w:sz="16" w:space="6" w:color="FF5168"/>
+        </w:pBdr>
+      </w:pPr>
+      <w:r>
+        <w:rPr>
+          <w:rFonts w:ascii="Fredoka" w:hAnsi="Fredoka" w:cs="Fredoka"/>
+          <w:b/>
+          <w:i w:val="0"/>
+          <w:color w:val="FFFFFF"/>
+          <w:sz w:val="28"/>
+          <w:shd w:val="clear" w:color="auto" w:fill="FF5168"/>
+        </w:rPr>
+        <w:t xml:space="preserve">  25  </w:t>
+      </w:r>
+      <w:r>
+        <w:rPr>
+          <w:rFonts w:ascii="Fredoka" w:hAnsi="Fredoka" w:cs="Fredoka"/>
+          <w:b w:val="0"/>
+          <w:i w:val="0"/>
+          <w:color w:val="3A3A4A"/>
+          <w:sz w:val="28"/>
+        </w:rPr>
+        <w:t xml:space="preserve">   </w:t>
+      </w:r>
+      <w:r>
+        <w:rPr>
+          <w:rFonts w:ascii="Fredoka" w:hAnsi="Fredoka" w:cs="Fredoka"/>
+          <w:b/>
+          <w:i w:val="0"/>
+          <w:color w:val="FF5168"/>
+          <w:sz w:val="48"/>
+        </w:rPr>
+        <w:t>Cupcakes ricos</w:t>
+      </w:r>
+    </w:p>
+    <w:p>
+      <w:pPr>
+        <w:spacing w:before="120" w:after="120" w:line="288" w:lineRule="auto"/>
+        <w:jc w:val="left"/>
+      </w:pPr>
+      <w:r>
+        <w:rPr>
+          <w:rFonts w:ascii="Nunito" w:hAnsi="Nunito" w:cs="Nunito"/>
+          <w:b w:val="0"/>
+          <w:i w:val="0"/>
+          <w:color w:val="3A3A4A"/>
+          <w:sz w:val="28"/>
+        </w:rPr>
+        <w:t>¡Cupcakes deliciosos! Cada uno tiene un número dentro de un corazón. Pega encima esa cantidad de cerezas (stickers): 1 cereza al cupcake 1, 2 al cupcake 2 y 3 al cupcake 3.</w:t>
+      </w:r>
+    </w:p>
+    <w:p>
+      <w:pPr>
+        <w:spacing w:before="80" w:after="80" w:line="240" w:lineRule="auto"/>
+        <w:jc w:val="center"/>
+      </w:pPr>
+      <w:r>
+        <w:drawing>
+          <wp:inline xmlns:a="http://schemas.openxmlformats.org/drawingml/2006/main" xmlns:pic="http://schemas.openxmlformats.org/drawingml/2006/picture">
+            <wp:extent cx="6336000" cy="4032678"/>
+            <wp:docPr id="28" name="Picture 28"/>
+            <wp:cNvGraphicFramePr>
+              <a:graphicFrameLocks noChangeAspect="1"/>
+            </wp:cNvGraphicFramePr>
+            <a:graphic>
+              <a:graphicData uri="http://schemas.openxmlformats.org/drawingml/2006/picture">
+                <pic:pic>
+                  <pic:nvPicPr>
+                    <pic:cNvPr id="0" name="28_cupcakes.png"/>
+                    <pic:cNvPicPr/>
+                  </pic:nvPicPr>
+                  <pic:blipFill>
+                    <a:blip r:embed="rId35"/>
+                    <a:stretch>
+                      <a:fillRect/>
+                    </a:stretch>
+                  </pic:blipFill>
+                  <pic:spPr>
+                    <a:xfrm>
+                      <a:off x="0" y="0"/>
+                      <a:ext cx="6336000" cy="4032678"/>
+                    </a:xfrm>
+                    <a:prstGeom prst="rect"/>
+                  </pic:spPr>
+                </pic:pic>
+              </a:graphicData>
+            </a:graphic>
+          </wp:inline>
+        </w:drawing>
+      </w:r>
+    </w:p>
+    <w:p>
+      <w:pPr>
+        <w:keepNext/>
+        <w:pageBreakBefore/>
+        <w:spacing w:before="0" w:after="40" w:line="283" w:lineRule="auto"/>
+        <w:jc w:val="left"/>
+        <w:pBdr>
+          <w:bottom w:val="single" w:sz="16" w:space="6" w:color="22A455"/>
+        </w:pBdr>
+      </w:pPr>
+      <w:r>
+        <w:rPr>
+          <w:rFonts w:ascii="Fredoka" w:hAnsi="Fredoka" w:cs="Fredoka"/>
+          <w:b/>
+          <w:i w:val="0"/>
+          <w:color w:val="FFFFFF"/>
+          <w:sz w:val="28"/>
+          <w:shd w:val="clear" w:color="auto" w:fill="22A455"/>
+        </w:rPr>
+        <w:t xml:space="preserve">  26  </w:t>
+      </w:r>
+      <w:r>
+        <w:rPr>
+          <w:rFonts w:ascii="Fredoka" w:hAnsi="Fredoka" w:cs="Fredoka"/>
+          <w:b w:val="0"/>
+          <w:i w:val="0"/>
+          <w:color w:val="3A3A4A"/>
+          <w:sz w:val="28"/>
+        </w:rPr>
+        <w:t xml:space="preserve">   </w:t>
+      </w:r>
+      <w:r>
+        <w:rPr>
+          <w:rFonts w:ascii="Fredoka" w:hAnsi="Fredoka" w:cs="Fredoka"/>
+          <w:b/>
+          <w:i w:val="0"/>
+          <w:color w:val="22A455"/>
+          <w:sz w:val="48"/>
+        </w:rPr>
+        <w:t>Tren de colores</w:t>
+      </w:r>
+    </w:p>
+    <w:p>
+      <w:pPr>
+        <w:spacing w:before="120" w:after="120" w:line="288" w:lineRule="auto"/>
+        <w:jc w:val="left"/>
+      </w:pPr>
+      <w:r>
+        <w:rPr>
+          <w:rFonts w:ascii="Nunito" w:hAnsi="Nunito" w:cs="Nunito"/>
+          <w:b w:val="0"/>
+          <w:i w:val="0"/>
+          <w:color w:val="3A3A4A"/>
+          <w:sz w:val="28"/>
+        </w:rPr>
+        <w:t>¡Sube la carga al tren! Cada vagón tiene su número, del 1 al 5. Pega encima de cada vagón esa cantidad de stickers como si fueran su carga y cuéntalos mientras el tren avanza por las vías.</w:t>
+      </w:r>
+    </w:p>
+    <w:p>
+      <w:pPr>
+        <w:spacing w:before="80" w:after="80" w:line="240" w:lineRule="auto"/>
+        <w:jc w:val="center"/>
+      </w:pPr>
+      <w:r>
+        <w:drawing>
+          <wp:inline xmlns:a="http://schemas.openxmlformats.org/drawingml/2006/main" xmlns:pic="http://schemas.openxmlformats.org/drawingml/2006/picture">
+            <wp:extent cx="6408000" cy="5182941"/>
+            <wp:docPr id="29" name="Picture 29"/>
+            <wp:cNvGraphicFramePr>
+              <a:graphicFrameLocks noChangeAspect="1"/>
+            </wp:cNvGraphicFramePr>
+            <a:graphic>
+              <a:graphicData uri="http://schemas.openxmlformats.org/drawingml/2006/picture">
+                <pic:pic>
+                  <pic:nvPicPr>
+                    <pic:cNvPr id="0" name="29_tren.png"/>
+                    <pic:cNvPicPr/>
+                  </pic:nvPicPr>
+                  <pic:blipFill>
+                    <a:blip r:embed="rId36"/>
+                    <a:stretch>
+                      <a:fillRect/>
+                    </a:stretch>
+                  </pic:blipFill>
+                  <pic:spPr>
+                    <a:xfrm>
+                      <a:off x="0" y="0"/>
+                      <a:ext cx="6408000" cy="5182941"/>
                     </a:xfrm>
                     <a:prstGeom prst="rect"/>
                   </pic:spPr>

</xml_diff>

<commit_message>
Apply feedback: collar pattern, cupcakes, kite tail, fix clipping, hand-based counting table
- Collar: pattern limited to red-blue-red.
- Cupcakes: number moved onto the wrapper; cherries now rest on the frosting
  (no longer floating).
- Kite tail bows now use several colors (red, blue, green, yellow).
- Fixed clipping on the kite (lowered diamond) and caterpillars (body slots
  now fit inside the canvas).
- Redesigned counting table as 'Cuento con mis manos' to match the reference
  photo: a hand showing each number, the numeral, and a tablet card with that
  many 16 mm sticker slots.
- Rebuild DOCX (fonts embedded) + PDF; 29 pages, no blank pages.

Co-authored-by: hectorrios-ui <hectorrios-ui@users.noreply.github.com>
</commit_message>
<xml_diff>
--- a/libro-stickers-digital/Libro_Actividades_Stickers_Mi_Dulce_Emma.docx
+++ b/libro-stickers-digital/Libro_Actividades_Stickers_Mi_Dulce_Emma.docx
@@ -1515,7 +1515,7 @@
       <w:r>
         <w:drawing>
           <wp:inline xmlns:a="http://schemas.openxmlformats.org/drawingml/2006/main" xmlns:pic="http://schemas.openxmlformats.org/drawingml/2006/picture">
-            <wp:extent cx="4464000" cy="6191831"/>
+            <wp:extent cx="4464000" cy="6120932"/>
             <wp:docPr id="9" name="Picture 9"/>
             <wp:cNvGraphicFramePr>
               <a:graphicFrameLocks noChangeAspect="1"/>
@@ -1536,7 +1536,7 @@
                   <pic:spPr>
                     <a:xfrm>
                       <a:off x="0" y="0"/>
-                      <a:ext cx="4464000" cy="6191831"/>
+                      <a:ext cx="4464000" cy="6120932"/>
                     </a:xfrm>
                     <a:prstGeom prst="rect"/>
                   </pic:spPr>
@@ -3170,7 +3170,7 @@
           <w:color w:val="3A3A4A"/>
           <w:sz w:val="28"/>
         </w:rPr>
-        <w:t>¡Arma un collar precioso! Observa el patrón de colores que ya empezó (rojo, azul, amarillo…) y continúalo pegando los stickers en el mismo orden. Trabajamos los patrones y la secuencia lógica.</w:t>
+        <w:t>¡Arma un collar precioso! Observa el patrón que ya empezó (rojo, azul, rojo, azul…) y continúalo pegando los stickers en el mismo orden hasta el final. Trabajamos los patrones y la secuencia lógica.</w:t>
       </w:r>
     </w:p>
     <w:p>
@@ -3252,7 +3252,7 @@
           <w:color w:val="2E8BFF"/>
           <w:sz w:val="48"/>
         </w:rPr>
-        <w:t>Tabla de conteo</w:t>
+        <w:t>Cuento con mis manos</w:t>
       </w:r>
     </w:p>
     <w:p>
@@ -3268,7 +3268,7 @@
           <w:color w:val="3A3A4A"/>
           <w:sz w:val="28"/>
         </w:rPr>
-        <w:t>Mira el número de cada columna y pega esa cantidad de stickers debajo: 1 en la columna del 1, 2 en la del 2… hasta el 5. Cuenta en voz alta para reforzar el conteo uno a uno y la noción de cantidad.</w:t>
+        <w:t>Mira cuántos dedos levanta cada mano y qué número es. Luego pega esa misma cantidad de stickers en la tablet de cada columna y cuenta en voz alta: 1, 2, 3, 4 y 5. Así relacionamos el número con la cantidad.</w:t>
       </w:r>
     </w:p>
     <w:p>
@@ -3279,7 +3279,7 @@
       <w:r>
         <w:drawing>
           <wp:inline xmlns:a="http://schemas.openxmlformats.org/drawingml/2006/main" xmlns:pic="http://schemas.openxmlformats.org/drawingml/2006/picture">
-            <wp:extent cx="6336000" cy="5038984"/>
+            <wp:extent cx="6408000" cy="6193144"/>
             <wp:docPr id="27" name="Picture 27"/>
             <wp:cNvGraphicFramePr>
               <a:graphicFrameLocks noChangeAspect="1"/>
@@ -3300,7 +3300,7 @@
                   <pic:spPr>
                     <a:xfrm>
                       <a:off x="0" y="0"/>
-                      <a:ext cx="6336000" cy="5038984"/>
+                      <a:ext cx="6408000" cy="6193144"/>
                     </a:xfrm>
                     <a:prstGeom prst="rect"/>
                   </pic:spPr>
@@ -3377,7 +3377,7 @@
       <w:r>
         <w:drawing>
           <wp:inline xmlns:a="http://schemas.openxmlformats.org/drawingml/2006/main" xmlns:pic="http://schemas.openxmlformats.org/drawingml/2006/picture">
-            <wp:extent cx="6336000" cy="4032678"/>
+            <wp:extent cx="6336000" cy="4174306"/>
             <wp:docPr id="28" name="Picture 28"/>
             <wp:cNvGraphicFramePr>
               <a:graphicFrameLocks noChangeAspect="1"/>
@@ -3398,7 +3398,7 @@
                   <pic:spPr>
                     <a:xfrm>
                       <a:off x="0" y="0"/>
-                      <a:ext cx="6336000" cy="4032678"/>
+                      <a:ext cx="6336000" cy="4174306"/>
                     </a:xfrm>
                     <a:prstGeom prst="rect"/>
                   </pic:spPr>

</xml_diff>

<commit_message>
Remove 'Manos contadoras' and single 'La mariquita'; renumber to 24 activities
- Drop the standalone ladybug (decorate) and the counting-hands pages per
  request; keep 'A contar mariquitas' and 'Cuento con mis manos'.
- Activity badge numbers are now computed from order (always consecutive).
- Delete unused assets; rebuild DOCX (fonts embedded) + PDF: 27 pages,
  24 activities, no blank pages.

Co-authored-by: hectorrios-ui <hectorrios-ui@users.noreply.github.com>
</commit_message>
<xml_diff>
--- a/libro-stickers-digital/Libro_Actividades_Stickers_Mi_Dulce_Emma.docx
+++ b/libro-stickers-digital/Libro_Actividades_Stickers_Mi_Dulce_Emma.docx
@@ -2370,104 +2370,6 @@
           <w:color w:val="FF5168"/>
           <w:sz w:val="48"/>
         </w:rPr>
-        <w:t>La mariquita</w:t>
-      </w:r>
-    </w:p>
-    <w:p>
-      <w:pPr>
-        <w:spacing w:before="120" w:after="120" w:line="288" w:lineRule="auto"/>
-        <w:jc w:val="left"/>
-      </w:pPr>
-      <w:r>
-        <w:rPr>
-          <w:rFonts w:ascii="Nunito" w:hAnsi="Nunito" w:cs="Nunito"/>
-          <w:b w:val="0"/>
-          <w:i w:val="0"/>
-          <w:color w:val="3A3A4A"/>
-          <w:sz w:val="28"/>
-        </w:rPr>
-        <w:t>Esta mariquita necesita sus puntitos para lucir hermosa. Pega stickers negros sobre su espalda roja repartiéndolos a ambos lados y, al terminar, cuéntalos uno por uno.</w:t>
-      </w:r>
-    </w:p>
-    <w:p>
-      <w:pPr>
-        <w:spacing w:before="80" w:after="80" w:line="240" w:lineRule="auto"/>
-        <w:jc w:val="center"/>
-      </w:pPr>
-      <w:r>
-        <w:drawing>
-          <wp:inline xmlns:a="http://schemas.openxmlformats.org/drawingml/2006/main" xmlns:pic="http://schemas.openxmlformats.org/drawingml/2006/picture">
-            <wp:extent cx="5903999" cy="5761608"/>
-            <wp:docPr id="18" name="Picture 18"/>
-            <wp:cNvGraphicFramePr>
-              <a:graphicFrameLocks noChangeAspect="1"/>
-            </wp:cNvGraphicFramePr>
-            <a:graphic>
-              <a:graphicData uri="http://schemas.openxmlformats.org/drawingml/2006/picture">
-                <pic:pic>
-                  <pic:nvPicPr>
-                    <pic:cNvPr id="0" name="19_mariquita.png"/>
-                    <pic:cNvPicPr/>
-                  </pic:nvPicPr>
-                  <pic:blipFill>
-                    <a:blip r:embed="rId25"/>
-                    <a:stretch>
-                      <a:fillRect/>
-                    </a:stretch>
-                  </pic:blipFill>
-                  <pic:spPr>
-                    <a:xfrm>
-                      <a:off x="0" y="0"/>
-                      <a:ext cx="5903999" cy="5761608"/>
-                    </a:xfrm>
-                    <a:prstGeom prst="rect"/>
-                  </pic:spPr>
-                </pic:pic>
-              </a:graphicData>
-            </a:graphic>
-          </wp:inline>
-        </w:drawing>
-      </w:r>
-    </w:p>
-    <w:p>
-      <w:pPr>
-        <w:keepNext/>
-        <w:pageBreakBefore/>
-        <w:spacing w:before="0" w:after="40" w:line="283" w:lineRule="auto"/>
-        <w:jc w:val="left"/>
-        <w:pBdr>
-          <w:bottom w:val="single" w:sz="16" w:space="6" w:color="FF5168"/>
-        </w:pBdr>
-      </w:pPr>
-      <w:r>
-        <w:rPr>
-          <w:rFonts w:ascii="Fredoka" w:hAnsi="Fredoka" w:cs="Fredoka"/>
-          <w:b/>
-          <w:i w:val="0"/>
-          <w:color w:val="FFFFFF"/>
-          <w:sz w:val="28"/>
-          <w:shd w:val="clear" w:color="auto" w:fill="FF5168"/>
-        </w:rPr>
-        <w:t xml:space="preserve">  16  </w:t>
-      </w:r>
-      <w:r>
-        <w:rPr>
-          <w:rFonts w:ascii="Fredoka" w:hAnsi="Fredoka" w:cs="Fredoka"/>
-          <w:b w:val="0"/>
-          <w:i w:val="0"/>
-          <w:color w:val="3A3A4A"/>
-          <w:sz w:val="28"/>
-        </w:rPr>
-        <w:t xml:space="preserve">   </w:t>
-      </w:r>
-      <w:r>
-        <w:rPr>
-          <w:rFonts w:ascii="Fredoka" w:hAnsi="Fredoka" w:cs="Fredoka"/>
-          <w:b/>
-          <w:i w:val="0"/>
-          <w:color w:val="FF5168"/>
-          <w:sz w:val="48"/>
-        </w:rPr>
         <w:t>A contar mariquitas</w:t>
       </w:r>
     </w:p>
@@ -2496,7 +2398,7 @@
         <w:drawing>
           <wp:inline xmlns:a="http://schemas.openxmlformats.org/drawingml/2006/main" xmlns:pic="http://schemas.openxmlformats.org/drawingml/2006/picture">
             <wp:extent cx="6192000" cy="7055238"/>
-            <wp:docPr id="19" name="Picture 19"/>
+            <wp:docPr id="18" name="Picture 18"/>
             <wp:cNvGraphicFramePr>
               <a:graphicFrameLocks noChangeAspect="1"/>
             </wp:cNvGraphicFramePr>
@@ -2508,7 +2410,7 @@
                     <pic:cNvPicPr/>
                   </pic:nvPicPr>
                   <pic:blipFill>
-                    <a:blip r:embed="rId26"/>
+                    <a:blip r:embed="rId25"/>
                     <a:stretch>
                       <a:fillRect/>
                     </a:stretch>
@@ -2546,7 +2448,7 @@
           <w:sz w:val="28"/>
           <w:shd w:val="clear" w:color="auto" w:fill="22A455"/>
         </w:rPr>
-        <w:t xml:space="preserve">  17  </w:t>
+        <w:t xml:space="preserve">  16  </w:t>
       </w:r>
       <w:r>
         <w:rPr>
@@ -2594,7 +2496,7 @@
         <w:drawing>
           <wp:inline xmlns:a="http://schemas.openxmlformats.org/drawingml/2006/main" xmlns:pic="http://schemas.openxmlformats.org/drawingml/2006/picture">
             <wp:extent cx="5040000" cy="7056000"/>
-            <wp:docPr id="20" name="Picture 20"/>
+            <wp:docPr id="19" name="Picture 19"/>
             <wp:cNvGraphicFramePr>
               <a:graphicFrameLocks noChangeAspect="1"/>
             </wp:cNvGraphicFramePr>
@@ -2606,6 +2508,104 @@
                     <pic:cNvPicPr/>
                   </pic:nvPicPr>
                   <pic:blipFill>
+                    <a:blip r:embed="rId26"/>
+                    <a:stretch>
+                      <a:fillRect/>
+                    </a:stretch>
+                  </pic:blipFill>
+                  <pic:spPr>
+                    <a:xfrm>
+                      <a:off x="0" y="0"/>
+                      <a:ext cx="5040000" cy="7056000"/>
+                    </a:xfrm>
+                    <a:prstGeom prst="rect"/>
+                  </pic:spPr>
+                </pic:pic>
+              </a:graphicData>
+            </a:graphic>
+          </wp:inline>
+        </w:drawing>
+      </w:r>
+    </w:p>
+    <w:p>
+      <w:pPr>
+        <w:keepNext/>
+        <w:pageBreakBefore/>
+        <w:spacing w:before="0" w:after="40" w:line="283" w:lineRule="auto"/>
+        <w:jc w:val="left"/>
+        <w:pBdr>
+          <w:bottom w:val="single" w:sz="16" w:space="6" w:color="F0B021"/>
+        </w:pBdr>
+      </w:pPr>
+      <w:r>
+        <w:rPr>
+          <w:rFonts w:ascii="Fredoka" w:hAnsi="Fredoka" w:cs="Fredoka"/>
+          <w:b/>
+          <w:i w:val="0"/>
+          <w:color w:val="FFFFFF"/>
+          <w:sz w:val="28"/>
+          <w:shd w:val="clear" w:color="auto" w:fill="F0B021"/>
+        </w:rPr>
+        <w:t xml:space="preserve">  17  </w:t>
+      </w:r>
+      <w:r>
+        <w:rPr>
+          <w:rFonts w:ascii="Fredoka" w:hAnsi="Fredoka" w:cs="Fredoka"/>
+          <w:b w:val="0"/>
+          <w:i w:val="0"/>
+          <w:color w:val="3A3A4A"/>
+          <w:sz w:val="28"/>
+        </w:rPr>
+        <w:t xml:space="preserve">   </w:t>
+      </w:r>
+      <w:r>
+        <w:rPr>
+          <w:rFonts w:ascii="Fredoka" w:hAnsi="Fredoka" w:cs="Fredoka"/>
+          <w:b/>
+          <w:i w:val="0"/>
+          <w:color w:val="F0B021"/>
+          <w:sz w:val="48"/>
+        </w:rPr>
+        <w:t>Muchos y pocos</w:t>
+      </w:r>
+    </w:p>
+    <w:p>
+      <w:pPr>
+        <w:spacing w:before="120" w:after="120" w:line="288" w:lineRule="auto"/>
+        <w:jc w:val="left"/>
+      </w:pPr>
+      <w:r>
+        <w:rPr>
+          <w:rFonts w:ascii="Nunito" w:hAnsi="Nunito" w:cs="Nunito"/>
+          <w:b w:val="0"/>
+          <w:i w:val="0"/>
+          <w:color w:val="3A3A4A"/>
+          <w:sz w:val="28"/>
+        </w:rPr>
+        <w:t>Mira los frascos de ejemplo: uno tiene pocos stickers y el otro tiene muchos. Ahora llena tú los frascos vacíos: uno con pocos y otro con muchos. Así aprendemos las cantidades y comparamos dónde hay más y dónde hay menos.</w:t>
+      </w:r>
+    </w:p>
+    <w:p>
+      <w:pPr>
+        <w:spacing w:before="80" w:after="80" w:line="240" w:lineRule="auto"/>
+        <w:jc w:val="center"/>
+      </w:pPr>
+      <w:r>
+        <w:drawing>
+          <wp:inline xmlns:a="http://schemas.openxmlformats.org/drawingml/2006/main" xmlns:pic="http://schemas.openxmlformats.org/drawingml/2006/picture">
+            <wp:extent cx="6263999" cy="6046601"/>
+            <wp:docPr id="20" name="Picture 20"/>
+            <wp:cNvGraphicFramePr>
+              <a:graphicFrameLocks noChangeAspect="1"/>
+            </wp:cNvGraphicFramePr>
+            <a:graphic>
+              <a:graphicData uri="http://schemas.openxmlformats.org/drawingml/2006/picture">
+                <pic:pic>
+                  <pic:nvPicPr>
+                    <pic:cNvPr id="0" name="16_frascos.png"/>
+                    <pic:cNvPicPr/>
+                  </pic:nvPicPr>
+                  <pic:blipFill>
                     <a:blip r:embed="rId27"/>
                     <a:stretch>
                       <a:fillRect/>
@@ -2614,7 +2614,7 @@
                   <pic:spPr>
                     <a:xfrm>
                       <a:off x="0" y="0"/>
-                      <a:ext cx="5040000" cy="7056000"/>
+                      <a:ext cx="6263999" cy="6046601"/>
                     </a:xfrm>
                     <a:prstGeom prst="rect"/>
                   </pic:spPr>
@@ -2664,202 +2664,6 @@
           <w:color w:val="F0B021"/>
           <w:sz w:val="48"/>
         </w:rPr>
-        <w:t>Muchos y pocos</w:t>
-      </w:r>
-    </w:p>
-    <w:p>
-      <w:pPr>
-        <w:spacing w:before="120" w:after="120" w:line="288" w:lineRule="auto"/>
-        <w:jc w:val="left"/>
-      </w:pPr>
-      <w:r>
-        <w:rPr>
-          <w:rFonts w:ascii="Nunito" w:hAnsi="Nunito" w:cs="Nunito"/>
-          <w:b w:val="0"/>
-          <w:i w:val="0"/>
-          <w:color w:val="3A3A4A"/>
-          <w:sz w:val="28"/>
-        </w:rPr>
-        <w:t>Mira los frascos de ejemplo: uno tiene pocos stickers y el otro tiene muchos. Ahora llena tú los frascos vacíos: uno con pocos y otro con muchos. Así aprendemos las cantidades y comparamos dónde hay más y dónde hay menos.</w:t>
-      </w:r>
-    </w:p>
-    <w:p>
-      <w:pPr>
-        <w:spacing w:before="80" w:after="80" w:line="240" w:lineRule="auto"/>
-        <w:jc w:val="center"/>
-      </w:pPr>
-      <w:r>
-        <w:drawing>
-          <wp:inline xmlns:a="http://schemas.openxmlformats.org/drawingml/2006/main" xmlns:pic="http://schemas.openxmlformats.org/drawingml/2006/picture">
-            <wp:extent cx="6263999" cy="6046601"/>
-            <wp:docPr id="21" name="Picture 21"/>
-            <wp:cNvGraphicFramePr>
-              <a:graphicFrameLocks noChangeAspect="1"/>
-            </wp:cNvGraphicFramePr>
-            <a:graphic>
-              <a:graphicData uri="http://schemas.openxmlformats.org/drawingml/2006/picture">
-                <pic:pic>
-                  <pic:nvPicPr>
-                    <pic:cNvPr id="0" name="16_frascos.png"/>
-                    <pic:cNvPicPr/>
-                  </pic:nvPicPr>
-                  <pic:blipFill>
-                    <a:blip r:embed="rId28"/>
-                    <a:stretch>
-                      <a:fillRect/>
-                    </a:stretch>
-                  </pic:blipFill>
-                  <pic:spPr>
-                    <a:xfrm>
-                      <a:off x="0" y="0"/>
-                      <a:ext cx="6263999" cy="6046601"/>
-                    </a:xfrm>
-                    <a:prstGeom prst="rect"/>
-                  </pic:spPr>
-                </pic:pic>
-              </a:graphicData>
-            </a:graphic>
-          </wp:inline>
-        </w:drawing>
-      </w:r>
-    </w:p>
-    <w:p>
-      <w:pPr>
-        <w:keepNext/>
-        <w:pageBreakBefore/>
-        <w:spacing w:before="0" w:after="40" w:line="283" w:lineRule="auto"/>
-        <w:jc w:val="left"/>
-        <w:pBdr>
-          <w:bottom w:val="single" w:sz="16" w:space="6" w:color="2E8BFF"/>
-        </w:pBdr>
-      </w:pPr>
-      <w:r>
-        <w:rPr>
-          <w:rFonts w:ascii="Fredoka" w:hAnsi="Fredoka" w:cs="Fredoka"/>
-          <w:b/>
-          <w:i w:val="0"/>
-          <w:color w:val="FFFFFF"/>
-          <w:sz w:val="28"/>
-          <w:shd w:val="clear" w:color="auto" w:fill="2E8BFF"/>
-        </w:rPr>
-        <w:t xml:space="preserve">  19  </w:t>
-      </w:r>
-      <w:r>
-        <w:rPr>
-          <w:rFonts w:ascii="Fredoka" w:hAnsi="Fredoka" w:cs="Fredoka"/>
-          <w:b w:val="0"/>
-          <w:i w:val="0"/>
-          <w:color w:val="3A3A4A"/>
-          <w:sz w:val="28"/>
-        </w:rPr>
-        <w:t xml:space="preserve">   </w:t>
-      </w:r>
-      <w:r>
-        <w:rPr>
-          <w:rFonts w:ascii="Fredoka" w:hAnsi="Fredoka" w:cs="Fredoka"/>
-          <w:b/>
-          <w:i w:val="0"/>
-          <w:color w:val="2E8BFF"/>
-          <w:sz w:val="48"/>
-        </w:rPr>
-        <w:t>Manos contadoras</w:t>
-      </w:r>
-    </w:p>
-    <w:p>
-      <w:pPr>
-        <w:spacing w:before="120" w:after="120" w:line="288" w:lineRule="auto"/>
-        <w:jc w:val="left"/>
-      </w:pPr>
-      <w:r>
-        <w:rPr>
-          <w:rFonts w:ascii="Nunito" w:hAnsi="Nunito" w:cs="Nunito"/>
-          <w:b w:val="0"/>
-          <w:i w:val="0"/>
-          <w:color w:val="3A3A4A"/>
-          <w:sz w:val="28"/>
-        </w:rPr>
-        <w:t>¡A contar con los deditos! Pega un sticker en la yema de cada dedo y cuéntalos uno a uno: 1, 2, 3… hasta llegar a 10. Ideal para practicar el conteo uno a uno y la coordinación de las manitos.</w:t>
-      </w:r>
-    </w:p>
-    <w:p>
-      <w:pPr>
-        <w:spacing w:before="80" w:after="80" w:line="240" w:lineRule="auto"/>
-        <w:jc w:val="center"/>
-      </w:pPr>
-      <w:r>
-        <w:drawing>
-          <wp:inline xmlns:a="http://schemas.openxmlformats.org/drawingml/2006/main" xmlns:pic="http://schemas.openxmlformats.org/drawingml/2006/picture">
-            <wp:extent cx="6408000" cy="4606221"/>
-            <wp:docPr id="22" name="Picture 22"/>
-            <wp:cNvGraphicFramePr>
-              <a:graphicFrameLocks noChangeAspect="1"/>
-            </wp:cNvGraphicFramePr>
-            <a:graphic>
-              <a:graphicData uri="http://schemas.openxmlformats.org/drawingml/2006/picture">
-                <pic:pic>
-                  <pic:nvPicPr>
-                    <pic:cNvPr id="0" name="22_manos.png"/>
-                    <pic:cNvPicPr/>
-                  </pic:nvPicPr>
-                  <pic:blipFill>
-                    <a:blip r:embed="rId29"/>
-                    <a:stretch>
-                      <a:fillRect/>
-                    </a:stretch>
-                  </pic:blipFill>
-                  <pic:spPr>
-                    <a:xfrm>
-                      <a:off x="0" y="0"/>
-                      <a:ext cx="6408000" cy="4606221"/>
-                    </a:xfrm>
-                    <a:prstGeom prst="rect"/>
-                  </pic:spPr>
-                </pic:pic>
-              </a:graphicData>
-            </a:graphic>
-          </wp:inline>
-        </w:drawing>
-      </w:r>
-    </w:p>
-    <w:p>
-      <w:pPr>
-        <w:keepNext/>
-        <w:pageBreakBefore/>
-        <w:spacing w:before="0" w:after="40" w:line="283" w:lineRule="auto"/>
-        <w:jc w:val="left"/>
-        <w:pBdr>
-          <w:bottom w:val="single" w:sz="16" w:space="6" w:color="F0B021"/>
-        </w:pBdr>
-      </w:pPr>
-      <w:r>
-        <w:rPr>
-          <w:rFonts w:ascii="Fredoka" w:hAnsi="Fredoka" w:cs="Fredoka"/>
-          <w:b/>
-          <w:i w:val="0"/>
-          <w:color w:val="FFFFFF"/>
-          <w:sz w:val="28"/>
-          <w:shd w:val="clear" w:color="auto" w:fill="F0B021"/>
-        </w:rPr>
-        <w:t xml:space="preserve">  20  </w:t>
-      </w:r>
-      <w:r>
-        <w:rPr>
-          <w:rFonts w:ascii="Fredoka" w:hAnsi="Fredoka" w:cs="Fredoka"/>
-          <w:b w:val="0"/>
-          <w:i w:val="0"/>
-          <w:color w:val="3A3A4A"/>
-          <w:sz w:val="28"/>
-        </w:rPr>
-        <w:t xml:space="preserve">   </w:t>
-      </w:r>
-      <w:r>
-        <w:rPr>
-          <w:rFonts w:ascii="Fredoka" w:hAnsi="Fredoka" w:cs="Fredoka"/>
-          <w:b/>
-          <w:i w:val="0"/>
-          <w:color w:val="F0B021"/>
-          <w:sz w:val="48"/>
-        </w:rPr>
         <w:t>La abeja y la flor</w:t>
       </w:r>
     </w:p>
@@ -2888,7 +2692,7 @@
         <w:drawing>
           <wp:inline xmlns:a="http://schemas.openxmlformats.org/drawingml/2006/main" xmlns:pic="http://schemas.openxmlformats.org/drawingml/2006/picture">
             <wp:extent cx="3168000" cy="7200678"/>
-            <wp:docPr id="23" name="Picture 23"/>
+            <wp:docPr id="21" name="Picture 21"/>
             <wp:cNvGraphicFramePr>
               <a:graphicFrameLocks noChangeAspect="1"/>
             </wp:cNvGraphicFramePr>
@@ -2900,7 +2704,7 @@
                     <pic:cNvPicPr/>
                   </pic:nvPicPr>
                   <pic:blipFill>
-                    <a:blip r:embed="rId30"/>
+                    <a:blip r:embed="rId28"/>
                     <a:stretch>
                       <a:fillRect/>
                     </a:stretch>
@@ -2938,7 +2742,7 @@
           <w:sz w:val="28"/>
           <w:shd w:val="clear" w:color="auto" w:fill="FF5168"/>
         </w:rPr>
-        <w:t xml:space="preserve">  21  </w:t>
+        <w:t xml:space="preserve">  19  </w:t>
       </w:r>
       <w:r>
         <w:rPr>
@@ -2986,7 +2790,7 @@
         <w:drawing>
           <wp:inline xmlns:a="http://schemas.openxmlformats.org/drawingml/2006/main" xmlns:pic="http://schemas.openxmlformats.org/drawingml/2006/picture">
             <wp:extent cx="3600000" cy="7200000"/>
-            <wp:docPr id="24" name="Picture 24"/>
+            <wp:docPr id="22" name="Picture 22"/>
             <wp:cNvGraphicFramePr>
               <a:graphicFrameLocks noChangeAspect="1"/>
             </wp:cNvGraphicFramePr>
@@ -2998,7 +2802,7 @@
                     <pic:cNvPicPr/>
                   </pic:nvPicPr>
                   <pic:blipFill>
-                    <a:blip r:embed="rId31"/>
+                    <a:blip r:embed="rId29"/>
                     <a:stretch>
                       <a:fillRect/>
                     </a:stretch>
@@ -3036,7 +2840,7 @@
           <w:sz w:val="28"/>
           <w:shd w:val="clear" w:color="auto" w:fill="22A455"/>
         </w:rPr>
-        <w:t xml:space="preserve">  22  </w:t>
+        <w:t xml:space="preserve">  20  </w:t>
       </w:r>
       <w:r>
         <w:rPr>
@@ -3084,7 +2888,7 @@
         <w:drawing>
           <wp:inline xmlns:a="http://schemas.openxmlformats.org/drawingml/2006/main" xmlns:pic="http://schemas.openxmlformats.org/drawingml/2006/picture">
             <wp:extent cx="6336000" cy="2735661"/>
-            <wp:docPr id="25" name="Picture 25"/>
+            <wp:docPr id="23" name="Picture 23"/>
             <wp:cNvGraphicFramePr>
               <a:graphicFrameLocks noChangeAspect="1"/>
             </wp:cNvGraphicFramePr>
@@ -3096,7 +2900,7 @@
                     <pic:cNvPicPr/>
                   </pic:nvPicPr>
                   <pic:blipFill>
-                    <a:blip r:embed="rId32"/>
+                    <a:blip r:embed="rId30"/>
                     <a:stretch>
                       <a:fillRect/>
                     </a:stretch>
@@ -3134,7 +2938,7 @@
           <w:sz w:val="28"/>
           <w:shd w:val="clear" w:color="auto" w:fill="7E4FC0"/>
         </w:rPr>
-        <w:t xml:space="preserve">  23  </w:t>
+        <w:t xml:space="preserve">  21  </w:t>
       </w:r>
       <w:r>
         <w:rPr>
@@ -3182,7 +2986,7 @@
         <w:drawing>
           <wp:inline xmlns:a="http://schemas.openxmlformats.org/drawingml/2006/main" xmlns:pic="http://schemas.openxmlformats.org/drawingml/2006/picture">
             <wp:extent cx="6192000" cy="2735407"/>
-            <wp:docPr id="26" name="Picture 26"/>
+            <wp:docPr id="24" name="Picture 24"/>
             <wp:cNvGraphicFramePr>
               <a:graphicFrameLocks noChangeAspect="1"/>
             </wp:cNvGraphicFramePr>
@@ -3194,7 +2998,7 @@
                     <pic:cNvPicPr/>
                   </pic:nvPicPr>
                   <pic:blipFill>
-                    <a:blip r:embed="rId33"/>
+                    <a:blip r:embed="rId31"/>
                     <a:stretch>
                       <a:fillRect/>
                     </a:stretch>
@@ -3232,7 +3036,7 @@
           <w:sz w:val="28"/>
           <w:shd w:val="clear" w:color="auto" w:fill="2E8BFF"/>
         </w:rPr>
-        <w:t xml:space="preserve">  24  </w:t>
+        <w:t xml:space="preserve">  22  </w:t>
       </w:r>
       <w:r>
         <w:rPr>
@@ -3280,7 +3084,7 @@
         <w:drawing>
           <wp:inline xmlns:a="http://schemas.openxmlformats.org/drawingml/2006/main" xmlns:pic="http://schemas.openxmlformats.org/drawingml/2006/picture">
             <wp:extent cx="6408000" cy="6193144"/>
-            <wp:docPr id="27" name="Picture 27"/>
+            <wp:docPr id="25" name="Picture 25"/>
             <wp:cNvGraphicFramePr>
               <a:graphicFrameLocks noChangeAspect="1"/>
             </wp:cNvGraphicFramePr>
@@ -3292,7 +3096,7 @@
                     <pic:cNvPicPr/>
                   </pic:nvPicPr>
                   <pic:blipFill>
-                    <a:blip r:embed="rId34"/>
+                    <a:blip r:embed="rId32"/>
                     <a:stretch>
                       <a:fillRect/>
                     </a:stretch>
@@ -3330,7 +3134,7 @@
           <w:sz w:val="28"/>
           <w:shd w:val="clear" w:color="auto" w:fill="FF5168"/>
         </w:rPr>
-        <w:t xml:space="preserve">  25  </w:t>
+        <w:t xml:space="preserve">  23  </w:t>
       </w:r>
       <w:r>
         <w:rPr>
@@ -3378,7 +3182,7 @@
         <w:drawing>
           <wp:inline xmlns:a="http://schemas.openxmlformats.org/drawingml/2006/main" xmlns:pic="http://schemas.openxmlformats.org/drawingml/2006/picture">
             <wp:extent cx="6336000" cy="4174306"/>
-            <wp:docPr id="28" name="Picture 28"/>
+            <wp:docPr id="26" name="Picture 26"/>
             <wp:cNvGraphicFramePr>
               <a:graphicFrameLocks noChangeAspect="1"/>
             </wp:cNvGraphicFramePr>
@@ -3390,7 +3194,7 @@
                     <pic:cNvPicPr/>
                   </pic:nvPicPr>
                   <pic:blipFill>
-                    <a:blip r:embed="rId35"/>
+                    <a:blip r:embed="rId33"/>
                     <a:stretch>
                       <a:fillRect/>
                     </a:stretch>
@@ -3428,7 +3232,7 @@
           <w:sz w:val="28"/>
           <w:shd w:val="clear" w:color="auto" w:fill="22A455"/>
         </w:rPr>
-        <w:t xml:space="preserve">  26  </w:t>
+        <w:t xml:space="preserve">  24  </w:t>
       </w:r>
       <w:r>
         <w:rPr>
@@ -3476,7 +3280,7 @@
         <w:drawing>
           <wp:inline xmlns:a="http://schemas.openxmlformats.org/drawingml/2006/main" xmlns:pic="http://schemas.openxmlformats.org/drawingml/2006/picture">
             <wp:extent cx="6408000" cy="5182941"/>
-            <wp:docPr id="29" name="Picture 29"/>
+            <wp:docPr id="27" name="Picture 27"/>
             <wp:cNvGraphicFramePr>
               <a:graphicFrameLocks noChangeAspect="1"/>
             </wp:cNvGraphicFramePr>
@@ -3488,7 +3292,7 @@
                     <pic:cNvPicPr/>
                   </pic:nvPicPr>
                   <pic:blipFill>
-                    <a:blip r:embed="rId36"/>
+                    <a:blip r:embed="rId34"/>
                     <a:stretch>
                       <a:fillRect/>
                     </a:stretch>

</xml_diff>

<commit_message>
Apply feedback round: cupcakes pyramid, better hands/cars, 2nd collar pattern, Quicksand text
- Cupcakes arranged in a pyramid; number inside a heart on the cup body.
- Redesigned the hands (count_hand) as clean fists with raised fingers.
- New unified, nicer car design; camino now shows two cars (blue + red).
- Collar: added a second pattern (yellow-green-yellow).
- Counting ladybugs smaller, well spaced, with bigger number badges.
- Cherries limited to 4 pairs with more spacing.
- Vertically center illustrations on the page; trim extra canvas whitespace.
- Body text now uses Quicksand (single-story round 'a'); headings keep Fredoka/
  Baloo. Fonts re-embedded; 27 pages, no blank pages.

Co-authored-by: hectorrios-ui <hectorrios-ui@users.noreply.github.com>
</commit_message>
<xml_diff>
--- a/libro-stickers-digital/Libro_Actividades_Stickers_Mi_Dulce_Emma.docx
+++ b/libro-stickers-digital/Libro_Actividades_Stickers_Mi_Dulce_Emma.docx
@@ -544,7 +544,7 @@
       </w:pPr>
       <w:r>
         <w:rPr>
-          <w:rFonts w:ascii="Nunito" w:hAnsi="Nunito" w:cs="Nunito"/>
+          <w:rFonts w:ascii="Quicksand" w:hAnsi="Quicksand" w:cs="Quicksand"/>
           <w:b/>
           <w:i w:val="0"/>
           <w:color w:val="3A3A4A"/>
@@ -554,7 +554,7 @@
       </w:r>
       <w:r>
         <w:rPr>
-          <w:rFonts w:ascii="Nunito" w:hAnsi="Nunito" w:cs="Nunito"/>
+          <w:rFonts w:ascii="Quicksand" w:hAnsi="Quicksand" w:cs="Quicksand"/>
           <w:b w:val="0"/>
           <w:i w:val="0"/>
           <w:color w:val="3A3A4A"/>
@@ -570,7 +570,7 @@
       </w:pPr>
       <w:r>
         <w:rPr>
-          <w:rFonts w:ascii="Nunito" w:hAnsi="Nunito" w:cs="Nunito"/>
+          <w:rFonts w:ascii="Quicksand" w:hAnsi="Quicksand" w:cs="Quicksand"/>
           <w:b w:val="0"/>
           <w:i w:val="0"/>
           <w:color w:val="3A3A4A"/>
@@ -586,7 +586,7 @@
       </w:pPr>
       <w:r>
         <w:rPr>
-          <w:rFonts w:ascii="Nunito" w:hAnsi="Nunito" w:cs="Nunito"/>
+          <w:rFonts w:ascii="Quicksand" w:hAnsi="Quicksand" w:cs="Quicksand"/>
           <w:b w:val="0"/>
           <w:i w:val="0"/>
           <w:color w:val="3A3A4A"/>
@@ -602,7 +602,7 @@
       </w:pPr>
       <w:r>
         <w:rPr>
-          <w:rFonts w:ascii="Nunito" w:hAnsi="Nunito" w:cs="Nunito"/>
+          <w:rFonts w:ascii="Quicksand" w:hAnsi="Quicksand" w:cs="Quicksand"/>
           <w:b w:val="0"/>
           <w:i/>
           <w:color w:val="3A3A4A"/>
@@ -725,7 +725,7 @@
       </w:pPr>
       <w:r>
         <w:rPr>
-          <w:rFonts w:ascii="Nunito" w:hAnsi="Nunito" w:cs="Nunito"/>
+          <w:rFonts w:ascii="Quicksand" w:hAnsi="Quicksand" w:cs="Quicksand"/>
           <w:b w:val="0"/>
           <w:i w:val="0"/>
           <w:color w:val="3A3A4A"/>
@@ -741,7 +741,7 @@
       </w:pPr>
       <w:r>
         <w:rPr>
-          <w:rFonts w:ascii="Nunito" w:hAnsi="Nunito" w:cs="Nunito"/>
+          <w:rFonts w:ascii="Quicksand" w:hAnsi="Quicksand" w:cs="Quicksand"/>
           <w:b w:val="0"/>
           <w:i w:val="0"/>
           <w:color w:val="3A3A4A"/>
@@ -774,7 +774,7 @@
       </w:pPr>
       <w:r>
         <w:rPr>
-          <w:rFonts w:ascii="Nunito" w:hAnsi="Nunito" w:cs="Nunito"/>
+          <w:rFonts w:ascii="Quicksand" w:hAnsi="Quicksand" w:cs="Quicksand"/>
           <w:b/>
           <w:i w:val="0"/>
           <w:color w:val="FF5168"/>
@@ -784,7 +784,7 @@
       </w:r>
       <w:r>
         <w:rPr>
-          <w:rFonts w:ascii="Nunito" w:hAnsi="Nunito" w:cs="Nunito"/>
+          <w:rFonts w:ascii="Quicksand" w:hAnsi="Quicksand" w:cs="Quicksand"/>
           <w:b w:val="0"/>
           <w:i w:val="0"/>
           <w:color w:val="3A3A4A"/>
@@ -801,7 +801,7 @@
       </w:pPr>
       <w:r>
         <w:rPr>
-          <w:rFonts w:ascii="Nunito" w:hAnsi="Nunito" w:cs="Nunito"/>
+          <w:rFonts w:ascii="Quicksand" w:hAnsi="Quicksand" w:cs="Quicksand"/>
           <w:b/>
           <w:i w:val="0"/>
           <w:color w:val="2E8BFF"/>
@@ -811,7 +811,7 @@
       </w:r>
       <w:r>
         <w:rPr>
-          <w:rFonts w:ascii="Nunito" w:hAnsi="Nunito" w:cs="Nunito"/>
+          <w:rFonts w:ascii="Quicksand" w:hAnsi="Quicksand" w:cs="Quicksand"/>
           <w:b w:val="0"/>
           <w:i w:val="0"/>
           <w:color w:val="3A3A4A"/>
@@ -828,7 +828,7 @@
       </w:pPr>
       <w:r>
         <w:rPr>
-          <w:rFonts w:ascii="Nunito" w:hAnsi="Nunito" w:cs="Nunito"/>
+          <w:rFonts w:ascii="Quicksand" w:hAnsi="Quicksand" w:cs="Quicksand"/>
           <w:b/>
           <w:i w:val="0"/>
           <w:color w:val="F0B021"/>
@@ -838,7 +838,7 @@
       </w:r>
       <w:r>
         <w:rPr>
-          <w:rFonts w:ascii="Nunito" w:hAnsi="Nunito" w:cs="Nunito"/>
+          <w:rFonts w:ascii="Quicksand" w:hAnsi="Quicksand" w:cs="Quicksand"/>
           <w:b w:val="0"/>
           <w:i w:val="0"/>
           <w:color w:val="3A3A4A"/>
@@ -855,7 +855,7 @@
       </w:pPr>
       <w:r>
         <w:rPr>
-          <w:rFonts w:ascii="Nunito" w:hAnsi="Nunito" w:cs="Nunito"/>
+          <w:rFonts w:ascii="Quicksand" w:hAnsi="Quicksand" w:cs="Quicksand"/>
           <w:b/>
           <w:i w:val="0"/>
           <w:color w:val="22A455"/>
@@ -865,7 +865,7 @@
       </w:r>
       <w:r>
         <w:rPr>
-          <w:rFonts w:ascii="Nunito" w:hAnsi="Nunito" w:cs="Nunito"/>
+          <w:rFonts w:ascii="Quicksand" w:hAnsi="Quicksand" w:cs="Quicksand"/>
           <w:b w:val="0"/>
           <w:i w:val="0"/>
           <w:color w:val="3A3A4A"/>
@@ -882,7 +882,7 @@
       </w:pPr>
       <w:r>
         <w:rPr>
-          <w:rFonts w:ascii="Nunito" w:hAnsi="Nunito" w:cs="Nunito"/>
+          <w:rFonts w:ascii="Quicksand" w:hAnsi="Quicksand" w:cs="Quicksand"/>
           <w:b/>
           <w:i w:val="0"/>
           <w:color w:val="FF5168"/>
@@ -892,7 +892,7 @@
       </w:r>
       <w:r>
         <w:rPr>
-          <w:rFonts w:ascii="Nunito" w:hAnsi="Nunito" w:cs="Nunito"/>
+          <w:rFonts w:ascii="Quicksand" w:hAnsi="Quicksand" w:cs="Quicksand"/>
           <w:b w:val="0"/>
           <w:i w:val="0"/>
           <w:color w:val="3A3A4A"/>
@@ -909,7 +909,7 @@
       </w:pPr>
       <w:r>
         <w:rPr>
-          <w:rFonts w:ascii="Nunito" w:hAnsi="Nunito" w:cs="Nunito"/>
+          <w:rFonts w:ascii="Quicksand" w:hAnsi="Quicksand" w:cs="Quicksand"/>
           <w:b/>
           <w:i w:val="0"/>
           <w:color w:val="2E8BFF"/>
@@ -919,7 +919,7 @@
       </w:r>
       <w:r>
         <w:rPr>
-          <w:rFonts w:ascii="Nunito" w:hAnsi="Nunito" w:cs="Nunito"/>
+          <w:rFonts w:ascii="Quicksand" w:hAnsi="Quicksand" w:cs="Quicksand"/>
           <w:b w:val="0"/>
           <w:i w:val="0"/>
           <w:color w:val="3A3A4A"/>
@@ -936,7 +936,7 @@
       </w:pPr>
       <w:r>
         <w:rPr>
-          <w:rFonts w:ascii="Nunito" w:hAnsi="Nunito" w:cs="Nunito"/>
+          <w:rFonts w:ascii="Quicksand" w:hAnsi="Quicksand" w:cs="Quicksand"/>
           <w:b/>
           <w:i w:val="0"/>
           <w:color w:val="F0B021"/>
@@ -946,7 +946,7 @@
       </w:r>
       <w:r>
         <w:rPr>
-          <w:rFonts w:ascii="Nunito" w:hAnsi="Nunito" w:cs="Nunito"/>
+          <w:rFonts w:ascii="Quicksand" w:hAnsi="Quicksand" w:cs="Quicksand"/>
           <w:b w:val="0"/>
           <w:i w:val="0"/>
           <w:color w:val="3A3A4A"/>
@@ -1008,7 +1008,7 @@
       </w:pPr>
       <w:r>
         <w:rPr>
-          <w:rFonts w:ascii="Nunito" w:hAnsi="Nunito" w:cs="Nunito"/>
+          <w:rFonts w:ascii="Quicksand" w:hAnsi="Quicksand" w:cs="Quicksand"/>
           <w:b w:val="0"/>
           <w:i w:val="0"/>
           <w:color w:val="3A3A4A"/>
@@ -1019,13 +1019,13 @@
     </w:p>
     <w:p>
       <w:pPr>
-        <w:spacing w:before="80" w:after="80" w:line="240" w:lineRule="auto"/>
+        <w:spacing w:before="1702" w:after="80" w:line="240" w:lineRule="auto"/>
         <w:jc w:val="center"/>
       </w:pPr>
       <w:r>
         <w:drawing>
           <wp:inline xmlns:a="http://schemas.openxmlformats.org/drawingml/2006/main" xmlns:pic="http://schemas.openxmlformats.org/drawingml/2006/picture">
-            <wp:extent cx="6263999" cy="5040677"/>
+            <wp:extent cx="5903999" cy="5039237"/>
             <wp:docPr id="4" name="Picture 4"/>
             <wp:cNvGraphicFramePr>
               <a:graphicFrameLocks noChangeAspect="1"/>
@@ -1046,7 +1046,7 @@
                   <pic:spPr>
                     <a:xfrm>
                       <a:off x="0" y="0"/>
-                      <a:ext cx="6263999" cy="5040677"/>
+                      <a:ext cx="5903999" cy="5039237"/>
                     </a:xfrm>
                     <a:prstGeom prst="rect"/>
                   </pic:spPr>
@@ -1106,7 +1106,7 @@
       </w:pPr>
       <w:r>
         <w:rPr>
-          <w:rFonts w:ascii="Nunito" w:hAnsi="Nunito" w:cs="Nunito"/>
+          <w:rFonts w:ascii="Quicksand" w:hAnsi="Quicksand" w:cs="Quicksand"/>
           <w:b w:val="0"/>
           <w:i w:val="0"/>
           <w:color w:val="3A3A4A"/>
@@ -1117,13 +1117,13 @@
     </w:p>
     <w:p>
       <w:pPr>
-        <w:spacing w:before="80" w:after="80" w:line="240" w:lineRule="auto"/>
+        <w:spacing w:before="2098" w:after="80" w:line="240" w:lineRule="auto"/>
         <w:jc w:val="center"/>
       </w:pPr>
       <w:r>
         <w:drawing>
           <wp:inline xmlns:a="http://schemas.openxmlformats.org/drawingml/2006/main" xmlns:pic="http://schemas.openxmlformats.org/drawingml/2006/picture">
-            <wp:extent cx="6336000" cy="5184339"/>
+            <wp:extent cx="6336000" cy="4535831"/>
             <wp:docPr id="5" name="Picture 5"/>
             <wp:cNvGraphicFramePr>
               <a:graphicFrameLocks noChangeAspect="1"/>
@@ -1144,7 +1144,7 @@
                   <pic:spPr>
                     <a:xfrm>
                       <a:off x="0" y="0"/>
-                      <a:ext cx="6336000" cy="5184339"/>
+                      <a:ext cx="6336000" cy="4535831"/>
                     </a:xfrm>
                     <a:prstGeom prst="rect"/>
                   </pic:spPr>
@@ -1204,7 +1204,7 @@
       </w:pPr>
       <w:r>
         <w:rPr>
-          <w:rFonts w:ascii="Nunito" w:hAnsi="Nunito" w:cs="Nunito"/>
+          <w:rFonts w:ascii="Quicksand" w:hAnsi="Quicksand" w:cs="Quicksand"/>
           <w:b w:val="0"/>
           <w:i w:val="0"/>
           <w:color w:val="3A3A4A"/>
@@ -1215,13 +1215,13 @@
     </w:p>
     <w:p>
       <w:pPr>
-        <w:spacing w:before="80" w:after="80" w:line="240" w:lineRule="auto"/>
+        <w:spacing w:before="1758" w:after="80" w:line="240" w:lineRule="auto"/>
         <w:jc w:val="center"/>
       </w:pPr>
       <w:r>
         <w:drawing>
           <wp:inline xmlns:a="http://schemas.openxmlformats.org/drawingml/2006/main" xmlns:pic="http://schemas.openxmlformats.org/drawingml/2006/picture">
-            <wp:extent cx="4752000" cy="5327831"/>
+            <wp:extent cx="4752000" cy="4967238"/>
             <wp:docPr id="6" name="Picture 6"/>
             <wp:cNvGraphicFramePr>
               <a:graphicFrameLocks noChangeAspect="1"/>
@@ -1242,7 +1242,7 @@
                   <pic:spPr>
                     <a:xfrm>
                       <a:off x="0" y="0"/>
-                      <a:ext cx="4752000" cy="5327831"/>
+                      <a:ext cx="4752000" cy="4967238"/>
                     </a:xfrm>
                     <a:prstGeom prst="rect"/>
                   </pic:spPr>
@@ -1302,7 +1302,7 @@
       </w:pPr>
       <w:r>
         <w:rPr>
-          <w:rFonts w:ascii="Nunito" w:hAnsi="Nunito" w:cs="Nunito"/>
+          <w:rFonts w:ascii="Quicksand" w:hAnsi="Quicksand" w:cs="Quicksand"/>
           <w:b w:val="0"/>
           <w:i w:val="0"/>
           <w:color w:val="3A3A4A"/>
@@ -1313,7 +1313,7 @@
     </w:p>
     <w:p>
       <w:pPr>
-        <w:spacing w:before="80" w:after="80" w:line="240" w:lineRule="auto"/>
+        <w:spacing w:before="1021" w:after="80" w:line="240" w:lineRule="auto"/>
         <w:jc w:val="center"/>
       </w:pPr>
       <w:r>
@@ -1400,7 +1400,7 @@
       </w:pPr>
       <w:r>
         <w:rPr>
-          <w:rFonts w:ascii="Nunito" w:hAnsi="Nunito" w:cs="Nunito"/>
+          <w:rFonts w:ascii="Quicksand" w:hAnsi="Quicksand" w:cs="Quicksand"/>
           <w:b w:val="0"/>
           <w:i w:val="0"/>
           <w:color w:val="3A3A4A"/>
@@ -1411,7 +1411,7 @@
     </w:p>
     <w:p>
       <w:pPr>
-        <w:spacing w:before="80" w:after="80" w:line="240" w:lineRule="auto"/>
+        <w:spacing w:before="1021" w:after="80" w:line="240" w:lineRule="auto"/>
         <w:jc w:val="center"/>
       </w:pPr>
       <w:r>
@@ -1498,7 +1498,7 @@
       </w:pPr>
       <w:r>
         <w:rPr>
-          <w:rFonts w:ascii="Nunito" w:hAnsi="Nunito" w:cs="Nunito"/>
+          <w:rFonts w:ascii="Quicksand" w:hAnsi="Quicksand" w:cs="Quicksand"/>
           <w:b w:val="0"/>
           <w:i w:val="0"/>
           <w:color w:val="3A3A4A"/>
@@ -1509,7 +1509,7 @@
     </w:p>
     <w:p>
       <w:pPr>
-        <w:spacing w:before="80" w:after="80" w:line="240" w:lineRule="auto"/>
+        <w:spacing w:before="850" w:after="80" w:line="240" w:lineRule="auto"/>
         <w:jc w:val="center"/>
       </w:pPr>
       <w:r>
@@ -1596,7 +1596,7 @@
       </w:pPr>
       <w:r>
         <w:rPr>
-          <w:rFonts w:ascii="Nunito" w:hAnsi="Nunito" w:cs="Nunito"/>
+          <w:rFonts w:ascii="Quicksand" w:hAnsi="Quicksand" w:cs="Quicksand"/>
           <w:b w:val="0"/>
           <w:i w:val="0"/>
           <w:color w:val="3A3A4A"/>
@@ -1607,13 +1607,13 @@
     </w:p>
     <w:p>
       <w:pPr>
-        <w:spacing w:before="80" w:after="80" w:line="240" w:lineRule="auto"/>
+        <w:spacing w:before="736" w:after="80" w:line="240" w:lineRule="auto"/>
         <w:jc w:val="center"/>
       </w:pPr>
       <w:r>
         <w:drawing>
           <wp:inline xmlns:a="http://schemas.openxmlformats.org/drawingml/2006/main" xmlns:pic="http://schemas.openxmlformats.org/drawingml/2006/picture">
-            <wp:extent cx="6192000" cy="6625440"/>
+            <wp:extent cx="6192000" cy="6264847"/>
             <wp:docPr id="10" name="Picture 10"/>
             <wp:cNvGraphicFramePr>
               <a:graphicFrameLocks noChangeAspect="1"/>
@@ -1634,7 +1634,7 @@
                   <pic:spPr>
                     <a:xfrm>
                       <a:off x="0" y="0"/>
-                      <a:ext cx="6192000" cy="6625440"/>
+                      <a:ext cx="6192000" cy="6264847"/>
                     </a:xfrm>
                     <a:prstGeom prst="rect"/>
                   </pic:spPr>
@@ -1694,7 +1694,7 @@
       </w:pPr>
       <w:r>
         <w:rPr>
-          <w:rFonts w:ascii="Nunito" w:hAnsi="Nunito" w:cs="Nunito"/>
+          <w:rFonts w:ascii="Quicksand" w:hAnsi="Quicksand" w:cs="Quicksand"/>
           <w:b w:val="0"/>
           <w:i w:val="0"/>
           <w:color w:val="3A3A4A"/>
@@ -1705,13 +1705,13 @@
     </w:p>
     <w:p>
       <w:pPr>
-        <w:spacing w:before="80" w:after="80" w:line="240" w:lineRule="auto"/>
+        <w:spacing w:before="1022" w:after="80" w:line="240" w:lineRule="auto"/>
         <w:jc w:val="center"/>
       </w:pPr>
       <w:r>
         <w:drawing>
           <wp:inline xmlns:a="http://schemas.openxmlformats.org/drawingml/2006/main" xmlns:pic="http://schemas.openxmlformats.org/drawingml/2006/picture">
-            <wp:extent cx="5472000" cy="5758475"/>
+            <wp:extent cx="5760000" cy="5902306"/>
             <wp:docPr id="11" name="Picture 11"/>
             <wp:cNvGraphicFramePr>
               <a:graphicFrameLocks noChangeAspect="1"/>
@@ -1732,7 +1732,7 @@
                   <pic:spPr>
                     <a:xfrm>
                       <a:off x="0" y="0"/>
-                      <a:ext cx="5472000" cy="5758475"/>
+                      <a:ext cx="5760000" cy="5902306"/>
                     </a:xfrm>
                     <a:prstGeom prst="rect"/>
                   </pic:spPr>
@@ -1792,7 +1792,7 @@
       </w:pPr>
       <w:r>
         <w:rPr>
-          <w:rFonts w:ascii="Nunito" w:hAnsi="Nunito" w:cs="Nunito"/>
+          <w:rFonts w:ascii="Quicksand" w:hAnsi="Quicksand" w:cs="Quicksand"/>
           <w:b w:val="0"/>
           <w:i w:val="0"/>
           <w:color w:val="3A3A4A"/>
@@ -1803,7 +1803,7 @@
     </w:p>
     <w:p>
       <w:pPr>
-        <w:spacing w:before="80" w:after="80" w:line="240" w:lineRule="auto"/>
+        <w:spacing w:before="1702" w:after="80" w:line="240" w:lineRule="auto"/>
         <w:jc w:val="center"/>
       </w:pPr>
       <w:r>
@@ -1890,7 +1890,7 @@
       </w:pPr>
       <w:r>
         <w:rPr>
-          <w:rFonts w:ascii="Nunito" w:hAnsi="Nunito" w:cs="Nunito"/>
+          <w:rFonts w:ascii="Quicksand" w:hAnsi="Quicksand" w:cs="Quicksand"/>
           <w:b w:val="0"/>
           <w:i w:val="0"/>
           <w:color w:val="3A3A4A"/>
@@ -1901,7 +1901,7 @@
     </w:p>
     <w:p>
       <w:pPr>
-        <w:spacing w:before="80" w:after="80" w:line="240" w:lineRule="auto"/>
+        <w:spacing w:before="1814" w:after="80" w:line="240" w:lineRule="auto"/>
         <w:jc w:val="center"/>
       </w:pPr>
       <w:r>
@@ -1988,7 +1988,7 @@
       </w:pPr>
       <w:r>
         <w:rPr>
-          <w:rFonts w:ascii="Nunito" w:hAnsi="Nunito" w:cs="Nunito"/>
+          <w:rFonts w:ascii="Quicksand" w:hAnsi="Quicksand" w:cs="Quicksand"/>
           <w:b w:val="0"/>
           <w:i w:val="0"/>
           <w:color w:val="3A3A4A"/>
@@ -1999,7 +1999,7 @@
     </w:p>
     <w:p>
       <w:pPr>
-        <w:spacing w:before="80" w:after="80" w:line="240" w:lineRule="auto"/>
+        <w:spacing w:before="1361" w:after="80" w:line="240" w:lineRule="auto"/>
         <w:jc w:val="center"/>
       </w:pPr>
       <w:r>
@@ -2086,7 +2086,7 @@
       </w:pPr>
       <w:r>
         <w:rPr>
-          <w:rFonts w:ascii="Nunito" w:hAnsi="Nunito" w:cs="Nunito"/>
+          <w:rFonts w:ascii="Quicksand" w:hAnsi="Quicksand" w:cs="Quicksand"/>
           <w:b w:val="0"/>
           <w:i w:val="0"/>
           <w:color w:val="3A3A4A"/>
@@ -2097,7 +2097,7 @@
     </w:p>
     <w:p>
       <w:pPr>
-        <w:spacing w:before="80" w:after="80" w:line="240" w:lineRule="auto"/>
+        <w:spacing w:before="2154" w:after="80" w:line="240" w:lineRule="auto"/>
         <w:jc w:val="center"/>
       </w:pPr>
       <w:r>
@@ -2184,7 +2184,7 @@
       </w:pPr>
       <w:r>
         <w:rPr>
-          <w:rFonts w:ascii="Nunito" w:hAnsi="Nunito" w:cs="Nunito"/>
+          <w:rFonts w:ascii="Quicksand" w:hAnsi="Quicksand" w:cs="Quicksand"/>
           <w:b w:val="0"/>
           <w:i w:val="0"/>
           <w:color w:val="3A3A4A"/>
@@ -2195,7 +2195,7 @@
     </w:p>
     <w:p>
       <w:pPr>
-        <w:spacing w:before="80" w:after="80" w:line="240" w:lineRule="auto"/>
+        <w:spacing w:before="1021" w:after="80" w:line="240" w:lineRule="auto"/>
         <w:jc w:val="center"/>
       </w:pPr>
       <w:r>
@@ -2282,7 +2282,7 @@
       </w:pPr>
       <w:r>
         <w:rPr>
-          <w:rFonts w:ascii="Nunito" w:hAnsi="Nunito" w:cs="Nunito"/>
+          <w:rFonts w:ascii="Quicksand" w:hAnsi="Quicksand" w:cs="Quicksand"/>
           <w:b w:val="0"/>
           <w:i w:val="0"/>
           <w:color w:val="3A3A4A"/>
@@ -2293,7 +2293,7 @@
     </w:p>
     <w:p>
       <w:pPr>
-        <w:spacing w:before="80" w:after="80" w:line="240" w:lineRule="auto"/>
+        <w:spacing w:before="1135" w:after="80" w:line="240" w:lineRule="auto"/>
         <w:jc w:val="center"/>
       </w:pPr>
       <w:r>
@@ -2380,7 +2380,7 @@
       </w:pPr>
       <w:r>
         <w:rPr>
-          <w:rFonts w:ascii="Nunito" w:hAnsi="Nunito" w:cs="Nunito"/>
+          <w:rFonts w:ascii="Quicksand" w:hAnsi="Quicksand" w:cs="Quicksand"/>
           <w:b w:val="0"/>
           <w:i w:val="0"/>
           <w:color w:val="3A3A4A"/>
@@ -2391,13 +2391,13 @@
     </w:p>
     <w:p>
       <w:pPr>
-        <w:spacing w:before="80" w:after="80" w:line="240" w:lineRule="auto"/>
+        <w:spacing w:before="680" w:after="80" w:line="240" w:lineRule="auto"/>
         <w:jc w:val="center"/>
       </w:pPr>
       <w:r>
         <w:drawing>
           <wp:inline xmlns:a="http://schemas.openxmlformats.org/drawingml/2006/main" xmlns:pic="http://schemas.openxmlformats.org/drawingml/2006/picture">
-            <wp:extent cx="6192000" cy="7055238"/>
+            <wp:extent cx="6336000" cy="6336000"/>
             <wp:docPr id="18" name="Picture 18"/>
             <wp:cNvGraphicFramePr>
               <a:graphicFrameLocks noChangeAspect="1"/>
@@ -2418,7 +2418,7 @@
                   <pic:spPr>
                     <a:xfrm>
                       <a:off x="0" y="0"/>
-                      <a:ext cx="6192000" cy="7055238"/>
+                      <a:ext cx="6336000" cy="6336000"/>
                     </a:xfrm>
                     <a:prstGeom prst="rect"/>
                   </pic:spPr>
@@ -2478,7 +2478,7 @@
       </w:pPr>
       <w:r>
         <w:rPr>
-          <w:rFonts w:ascii="Nunito" w:hAnsi="Nunito" w:cs="Nunito"/>
+          <w:rFonts w:ascii="Quicksand" w:hAnsi="Quicksand" w:cs="Quicksand"/>
           <w:b w:val="0"/>
           <w:i w:val="0"/>
           <w:color w:val="3A3A4A"/>
@@ -2489,7 +2489,7 @@
     </w:p>
     <w:p>
       <w:pPr>
-        <w:spacing w:before="80" w:after="80" w:line="240" w:lineRule="auto"/>
+        <w:spacing w:before="120" w:after="80" w:line="240" w:lineRule="auto"/>
         <w:jc w:val="center"/>
       </w:pPr>
       <w:r>
@@ -2576,7 +2576,7 @@
       </w:pPr>
       <w:r>
         <w:rPr>
-          <w:rFonts w:ascii="Nunito" w:hAnsi="Nunito" w:cs="Nunito"/>
+          <w:rFonts w:ascii="Quicksand" w:hAnsi="Quicksand" w:cs="Quicksand"/>
           <w:b w:val="0"/>
           <w:i w:val="0"/>
           <w:color w:val="3A3A4A"/>
@@ -2587,7 +2587,7 @@
     </w:p>
     <w:p>
       <w:pPr>
-        <w:spacing w:before="80" w:after="80" w:line="240" w:lineRule="auto"/>
+        <w:spacing w:before="908" w:after="80" w:line="240" w:lineRule="auto"/>
         <w:jc w:val="center"/>
       </w:pPr>
       <w:r>
@@ -2674,7 +2674,7 @@
       </w:pPr>
       <w:r>
         <w:rPr>
-          <w:rFonts w:ascii="Nunito" w:hAnsi="Nunito" w:cs="Nunito"/>
+          <w:rFonts w:ascii="Quicksand" w:hAnsi="Quicksand" w:cs="Quicksand"/>
           <w:b w:val="0"/>
           <w:i w:val="0"/>
           <w:color w:val="3A3A4A"/>
@@ -2685,13 +2685,13 @@
     </w:p>
     <w:p>
       <w:pPr>
-        <w:spacing w:before="80" w:after="80" w:line="240" w:lineRule="auto"/>
+        <w:spacing w:before="170" w:after="80" w:line="240" w:lineRule="auto"/>
         <w:jc w:val="center"/>
       </w:pPr>
       <w:r>
         <w:drawing>
           <wp:inline xmlns:a="http://schemas.openxmlformats.org/drawingml/2006/main" xmlns:pic="http://schemas.openxmlformats.org/drawingml/2006/picture">
-            <wp:extent cx="3168000" cy="7200678"/>
+            <wp:extent cx="3168000" cy="6984508"/>
             <wp:docPr id="21" name="Picture 21"/>
             <wp:cNvGraphicFramePr>
               <a:graphicFrameLocks noChangeAspect="1"/>
@@ -2712,7 +2712,7 @@
                   <pic:spPr>
                     <a:xfrm>
                       <a:off x="0" y="0"/>
-                      <a:ext cx="3168000" cy="7200678"/>
+                      <a:ext cx="3168000" cy="6984508"/>
                     </a:xfrm>
                     <a:prstGeom prst="rect"/>
                   </pic:spPr>
@@ -2772,7 +2772,7 @@
       </w:pPr>
       <w:r>
         <w:rPr>
-          <w:rFonts w:ascii="Nunito" w:hAnsi="Nunito" w:cs="Nunito"/>
+          <w:rFonts w:ascii="Quicksand" w:hAnsi="Quicksand" w:cs="Quicksand"/>
           <w:b w:val="0"/>
           <w:i w:val="0"/>
           <w:color w:val="3A3A4A"/>
@@ -2783,13 +2783,13 @@
     </w:p>
     <w:p>
       <w:pPr>
-        <w:spacing w:before="80" w:after="80" w:line="240" w:lineRule="auto"/>
+        <w:spacing w:before="454" w:after="80" w:line="240" w:lineRule="auto"/>
         <w:jc w:val="center"/>
       </w:pPr>
       <w:r>
         <w:drawing>
           <wp:inline xmlns:a="http://schemas.openxmlformats.org/drawingml/2006/main" xmlns:pic="http://schemas.openxmlformats.org/drawingml/2006/picture">
-            <wp:extent cx="3600000" cy="7200000"/>
+            <wp:extent cx="3600000" cy="6624000"/>
             <wp:docPr id="22" name="Picture 22"/>
             <wp:cNvGraphicFramePr>
               <a:graphicFrameLocks noChangeAspect="1"/>
@@ -2810,7 +2810,7 @@
                   <pic:spPr>
                     <a:xfrm>
                       <a:off x="0" y="0"/>
-                      <a:ext cx="3600000" cy="7200000"/>
+                      <a:ext cx="3600000" cy="6624000"/>
                     </a:xfrm>
                     <a:prstGeom prst="rect"/>
                   </pic:spPr>
@@ -2870,24 +2870,24 @@
       </w:pPr>
       <w:r>
         <w:rPr>
-          <w:rFonts w:ascii="Nunito" w:hAnsi="Nunito" w:cs="Nunito"/>
+          <w:rFonts w:ascii="Quicksand" w:hAnsi="Quicksand" w:cs="Quicksand"/>
           <w:b w:val="0"/>
           <w:i w:val="0"/>
           <w:color w:val="3A3A4A"/>
           <w:sz w:val="28"/>
         </w:rPr>
-        <w:t>El carrito quiere llegar a su casa. Pega un sticker en cada círculo del camino, de izquierda a derecha, para completar la ruta. Practicamos el trazo horizontal y la direccionalidad.</w:t>
+        <w:t>Los carritos quieren llegar a su casa. Pega un sticker en cada círculo del camino, de izquierda a derecha, para completar la ruta. Practicamos el trazo horizontal y la direccionalidad.</w:t>
       </w:r>
     </w:p>
     <w:p>
       <w:pPr>
-        <w:spacing w:before="80" w:after="80" w:line="240" w:lineRule="auto"/>
+        <w:spacing w:before="3290" w:after="80" w:line="240" w:lineRule="auto"/>
         <w:jc w:val="center"/>
       </w:pPr>
       <w:r>
         <w:drawing>
           <wp:inline xmlns:a="http://schemas.openxmlformats.org/drawingml/2006/main" xmlns:pic="http://schemas.openxmlformats.org/drawingml/2006/picture">
-            <wp:extent cx="6336000" cy="2735661"/>
+            <wp:extent cx="6336000" cy="3022645"/>
             <wp:docPr id="23" name="Picture 23"/>
             <wp:cNvGraphicFramePr>
               <a:graphicFrameLocks noChangeAspect="1"/>
@@ -2908,7 +2908,7 @@
                   <pic:spPr>
                     <a:xfrm>
                       <a:off x="0" y="0"/>
-                      <a:ext cx="6336000" cy="2735661"/>
+                      <a:ext cx="6336000" cy="3022645"/>
                     </a:xfrm>
                     <a:prstGeom prst="rect"/>
                   </pic:spPr>
@@ -2968,7 +2968,7 @@
       </w:pPr>
       <w:r>
         <w:rPr>
-          <w:rFonts w:ascii="Nunito" w:hAnsi="Nunito" w:cs="Nunito"/>
+          <w:rFonts w:ascii="Quicksand" w:hAnsi="Quicksand" w:cs="Quicksand"/>
           <w:b w:val="0"/>
           <w:i w:val="0"/>
           <w:color w:val="3A3A4A"/>
@@ -2979,13 +2979,13 @@
     </w:p>
     <w:p>
       <w:pPr>
-        <w:spacing w:before="80" w:after="80" w:line="240" w:lineRule="auto"/>
+        <w:spacing w:before="1474" w:after="80" w:line="240" w:lineRule="auto"/>
         <w:jc w:val="center"/>
       </w:pPr>
       <w:r>
         <w:drawing>
           <wp:inline xmlns:a="http://schemas.openxmlformats.org/drawingml/2006/main" xmlns:pic="http://schemas.openxmlformats.org/drawingml/2006/picture">
-            <wp:extent cx="6192000" cy="2735407"/>
+            <wp:extent cx="6192000" cy="5328762"/>
             <wp:docPr id="24" name="Picture 24"/>
             <wp:cNvGraphicFramePr>
               <a:graphicFrameLocks noChangeAspect="1"/>
@@ -3006,7 +3006,7 @@
                   <pic:spPr>
                     <a:xfrm>
                       <a:off x="0" y="0"/>
-                      <a:ext cx="6192000" cy="2735407"/>
+                      <a:ext cx="6192000" cy="5328762"/>
                     </a:xfrm>
                     <a:prstGeom prst="rect"/>
                   </pic:spPr>
@@ -3066,7 +3066,7 @@
       </w:pPr>
       <w:r>
         <w:rPr>
-          <w:rFonts w:ascii="Nunito" w:hAnsi="Nunito" w:cs="Nunito"/>
+          <w:rFonts w:ascii="Quicksand" w:hAnsi="Quicksand" w:cs="Quicksand"/>
           <w:b w:val="0"/>
           <w:i w:val="0"/>
           <w:color w:val="3A3A4A"/>
@@ -3077,7 +3077,7 @@
     </w:p>
     <w:p>
       <w:pPr>
-        <w:spacing w:before="80" w:after="80" w:line="240" w:lineRule="auto"/>
+        <w:spacing w:before="793" w:after="80" w:line="240" w:lineRule="auto"/>
         <w:jc w:val="center"/>
       </w:pPr>
       <w:r>
@@ -3164,7 +3164,7 @@
       </w:pPr>
       <w:r>
         <w:rPr>
-          <w:rFonts w:ascii="Nunito" w:hAnsi="Nunito" w:cs="Nunito"/>
+          <w:rFonts w:ascii="Quicksand" w:hAnsi="Quicksand" w:cs="Quicksand"/>
           <w:b w:val="0"/>
           <w:i w:val="0"/>
           <w:color w:val="3A3A4A"/>
@@ -3175,13 +3175,13 @@
     </w:p>
     <w:p>
       <w:pPr>
-        <w:spacing w:before="80" w:after="80" w:line="240" w:lineRule="auto"/>
+        <w:spacing w:before="1135" w:after="80" w:line="240" w:lineRule="auto"/>
         <w:jc w:val="center"/>
       </w:pPr>
       <w:r>
         <w:drawing>
           <wp:inline xmlns:a="http://schemas.openxmlformats.org/drawingml/2006/main" xmlns:pic="http://schemas.openxmlformats.org/drawingml/2006/picture">
-            <wp:extent cx="6336000" cy="4174306"/>
+            <wp:extent cx="6336000" cy="5758306"/>
             <wp:docPr id="26" name="Picture 26"/>
             <wp:cNvGraphicFramePr>
               <a:graphicFrameLocks noChangeAspect="1"/>
@@ -3202,7 +3202,7 @@
                   <pic:spPr>
                     <a:xfrm>
                       <a:off x="0" y="0"/>
-                      <a:ext cx="6336000" cy="4174306"/>
+                      <a:ext cx="6336000" cy="5758306"/>
                     </a:xfrm>
                     <a:prstGeom prst="rect"/>
                   </pic:spPr>
@@ -3262,7 +3262,7 @@
       </w:pPr>
       <w:r>
         <w:rPr>
-          <w:rFonts w:ascii="Nunito" w:hAnsi="Nunito" w:cs="Nunito"/>
+          <w:rFonts w:ascii="Quicksand" w:hAnsi="Quicksand" w:cs="Quicksand"/>
           <w:b w:val="0"/>
           <w:i w:val="0"/>
           <w:color w:val="3A3A4A"/>
@@ -3273,7 +3273,7 @@
     </w:p>
     <w:p>
       <w:pPr>
-        <w:spacing w:before="80" w:after="80" w:line="240" w:lineRule="auto"/>
+        <w:spacing w:before="1588" w:after="80" w:line="240" w:lineRule="auto"/>
         <w:jc w:val="center"/>
       </w:pPr>
       <w:r>
@@ -3707,7 +3707,7 @@
     <w:qFormat/>
     <w:rsid w:val="00FC693F"/>
     <w:rPr>
-      <w:rFonts w:ascii="Nunito" w:hAnsi="Nunito" w:cs="Nunito"/>
+      <w:rFonts w:ascii="Quicksand" w:hAnsi="Quicksand" w:cs="Quicksand"/>
       <w:color w:val="3A3A4A"/>
       <w:sz w:val="24"/>
     </w:rPr>

</xml_diff>

<commit_message>
Camino: two full scenes (car + path + house) stacked to use the space
Replace the two-cars-in-one-row layout with two complete rows (red and blue
cars, each with its own path and house). Rebuild DOCX + PDF.

Co-authored-by: hectorrios-ui <hectorrios-ui@users.noreply.github.com>
</commit_message>
<xml_diff>
--- a/libro-stickers-digital/Libro_Actividades_Stickers_Mi_Dulce_Emma.docx
+++ b/libro-stickers-digital/Libro_Actividades_Stickers_Mi_Dulce_Emma.docx
@@ -2876,18 +2876,18 @@
           <w:color w:val="3A3A4A"/>
           <w:sz w:val="28"/>
         </w:rPr>
-        <w:t>Los carritos quieren llegar a su casa. Pega un sticker en cada círculo del camino, de izquierda a derecha, para completar la ruta. Practicamos el trazo horizontal y la direccionalidad.</w:t>
+        <w:t>Cada carrito quiere llegar a su casa. Pega un sticker en cada círculo del camino, de izquierda a derecha, para completar las dos rutas. Practicamos el trazo horizontal y la direccionalidad.</w:t>
       </w:r>
     </w:p>
     <w:p>
       <w:pPr>
-        <w:spacing w:before="3290" w:after="80" w:line="240" w:lineRule="auto"/>
+        <w:spacing w:before="1303" w:after="80" w:line="240" w:lineRule="auto"/>
         <w:jc w:val="center"/>
       </w:pPr>
       <w:r>
         <w:drawing>
           <wp:inline xmlns:a="http://schemas.openxmlformats.org/drawingml/2006/main" xmlns:pic="http://schemas.openxmlformats.org/drawingml/2006/picture">
-            <wp:extent cx="6336000" cy="3022645"/>
+            <wp:extent cx="6336000" cy="5545864"/>
             <wp:docPr id="23" name="Picture 23"/>
             <wp:cNvGraphicFramePr>
               <a:graphicFrameLocks noChangeAspect="1"/>
@@ -2908,7 +2908,7 @@
                   <pic:spPr>
                     <a:xfrm>
                       <a:off x="0" y="0"/>
-                      <a:ext cx="6336000" cy="3022645"/>
+                      <a:ext cx="6336000" cy="5545864"/>
                     </a:xfrm>
                     <a:prstGeom prst="rect"/>
                   </pic:spPr>

</xml_diff>

<commit_message>
Cupcakes: nest cherries clearly on top of cream; conteo: enlarge canvas so number badges are not clipped
Co-authored-by: hectorrios-ui <hectorrios-ui@users.noreply.github.com>
</commit_message>
<xml_diff>
--- a/libro-stickers-digital/Libro_Actividades_Stickers_Mi_Dulce_Emma.docx
+++ b/libro-stickers-digital/Libro_Actividades_Stickers_Mi_Dulce_Emma.docx
@@ -2391,13 +2391,13 @@
     </w:p>
     <w:p>
       <w:pPr>
-        <w:spacing w:before="680" w:after="80" w:line="240" w:lineRule="auto"/>
+        <w:spacing w:before="284" w:after="80" w:line="240" w:lineRule="auto"/>
         <w:jc w:val="center"/>
       </w:pPr>
       <w:r>
         <w:drawing>
           <wp:inline xmlns:a="http://schemas.openxmlformats.org/drawingml/2006/main" xmlns:pic="http://schemas.openxmlformats.org/drawingml/2006/picture">
-            <wp:extent cx="6336000" cy="6336000"/>
+            <wp:extent cx="6336000" cy="6839153"/>
             <wp:docPr id="18" name="Picture 18"/>
             <wp:cNvGraphicFramePr>
               <a:graphicFrameLocks noChangeAspect="1"/>
@@ -2418,7 +2418,7 @@
                   <pic:spPr>
                     <a:xfrm>
                       <a:off x="0" y="0"/>
-                      <a:ext cx="6336000" cy="6336000"/>
+                      <a:ext cx="6336000" cy="6839153"/>
                     </a:xfrm>
                     <a:prstGeom prst="rect"/>
                   </pic:spPr>

</xml_diff>

<commit_message>
Redesign flower in abeja activity: cute pink daisy with face and stem (fits fully)
Co-authored-by: hectorrios-ui <hectorrios-ui@users.noreply.github.com>
</commit_message>
<xml_diff>
--- a/libro-stickers-digital/Libro_Actividades_Stickers_Mi_Dulce_Emma.docx
+++ b/libro-stickers-digital/Libro_Actividades_Stickers_Mi_Dulce_Emma.docx
@@ -2685,13 +2685,13 @@
     </w:p>
     <w:p>
       <w:pPr>
-        <w:spacing w:before="170" w:after="80" w:line="240" w:lineRule="auto"/>
+        <w:spacing w:before="120" w:after="80" w:line="240" w:lineRule="auto"/>
         <w:jc w:val="center"/>
       </w:pPr>
       <w:r>
         <w:drawing>
           <wp:inline xmlns:a="http://schemas.openxmlformats.org/drawingml/2006/main" xmlns:pic="http://schemas.openxmlformats.org/drawingml/2006/picture">
-            <wp:extent cx="3168000" cy="6984508"/>
+            <wp:extent cx="3311999" cy="7200675"/>
             <wp:docPr id="21" name="Picture 21"/>
             <wp:cNvGraphicFramePr>
               <a:graphicFrameLocks noChangeAspect="1"/>
@@ -2712,7 +2712,7 @@
                   <pic:spPr>
                     <a:xfrm>
                       <a:off x="0" y="0"/>
-                      <a:ext cx="3168000" cy="6984508"/>
+                      <a:ext cx="3311999" cy="7200675"/>
                     </a:xfrm>
                     <a:prstGeom prst="rect"/>
                   </pic:spPr>

</xml_diff>